<commit_message>
Complete Group 4A assistants
</commit_message>
<xml_diff>
--- a/.kiro/docs/features/digital-assistants-catalog.docx
+++ b/.kiro/docs/features/digital-assistants-catalog.docx
@@ -2217,19 +2217,7 @@
         <w:rPr>
           <w:rFonts w:asciiTheme="majorHAnsi" w:hAnsiTheme="majorHAnsi" w:cstheme="majorHAnsi"/>
         </w:rPr>
-        <w:t xml:space="preserve"> done </w:t>
-      </w:r>
-      <w:r>
-        <w:rPr>
-          <w:rFonts w:ascii="Calibri" w:hAnsi="Calibri" w:cs="Calibri"/>
-        </w:rPr>
-        <w:t>·</w:t>
-      </w:r>
-      <w:r>
-        <w:rPr>
-          <w:rFonts w:asciiTheme="majorHAnsi" w:hAnsiTheme="majorHAnsi" w:cstheme="majorHAnsi"/>
-        </w:rPr>
-        <w:t xml:space="preserve"> </w:t>
+        <w:t xml:space="preserve"> done · </w:t>
       </w:r>
       <w:r>
         <w:rPr>
@@ -5079,14 +5067,20 @@
     <w:p>
       <w:pPr>
         <w:pStyle w:val="Heading3"/>
-      </w:pPr>
-      <w:r>
         <w:rPr>
           <w:rFonts w:cstheme="majorHAnsi"/>
         </w:rPr>
+      </w:pPr>
+      <w:r>
+        <w:rPr>
+          <w:rFonts w:cstheme="majorHAnsi"/>
+        </w:rPr>
         <w:br w:type="page"/>
       </w:r>
       <w:r>
+        <w:rPr>
+          <w:rFonts w:cstheme="majorHAnsi"/>
+        </w:rPr>
         <w:lastRenderedPageBreak/>
         <w:t>Group 7 — Payroll Assistant (Category B + scheduled document generation — independent)</w:t>
       </w:r>
@@ -5316,203 +5310,312 @@
         </w:tc>
       </w:tr>
     </w:tbl>
-    <w:p/>
-    <w:p>
-      <w:r>
+    <w:p>
+      <w:pPr>
+        <w:rPr>
+          <w:rFonts w:asciiTheme="majorHAnsi" w:hAnsiTheme="majorHAnsi" w:cstheme="majorHAnsi"/>
+        </w:rPr>
+      </w:pPr>
+    </w:p>
+    <w:p>
+      <w:pPr>
+        <w:rPr>
+          <w:rFonts w:asciiTheme="majorHAnsi" w:hAnsiTheme="majorHAnsi" w:cstheme="majorHAnsi"/>
+        </w:rPr>
+      </w:pPr>
+      <w:r>
+        <w:rPr>
+          <w:rFonts w:asciiTheme="majorHAnsi" w:hAnsiTheme="majorHAnsi" w:cstheme="majorHAnsi"/>
+        </w:rPr>
         <w:t xml:space="preserve">The Payroll Assistant is </w:t>
       </w:r>
       <w:r>
         <w:rPr>
+          <w:rFonts w:asciiTheme="majorHAnsi" w:hAnsiTheme="majorHAnsi" w:cstheme="majorHAnsi"/>
           <w:b/>
           <w:bCs/>
         </w:rPr>
         <w:t>independent, like Recurring Invoices</w:t>
       </w:r>
       <w:r>
+        <w:rPr>
+          <w:rFonts w:asciiTheme="majorHAnsi" w:hAnsiTheme="majorHAnsi" w:cstheme="majorHAnsi"/>
+        </w:rPr>
         <w:t xml:space="preserve"> — a scheduled 4. </w:t>
       </w:r>
       <w:r>
         <w:rPr>
+          <w:rFonts w:asciiTheme="majorHAnsi" w:hAnsiTheme="majorHAnsi" w:cstheme="majorHAnsi"/>
           <w:b/>
           <w:bCs/>
         </w:rPr>
         <w:t>Group 6 — Recurring Invoices</w:t>
       </w:r>
       <w:r>
+        <w:rPr>
+          <w:rFonts w:asciiTheme="majorHAnsi" w:hAnsiTheme="majorHAnsi" w:cstheme="majorHAnsi"/>
+        </w:rPr>
         <w:t xml:space="preserve"> — adds document generation on top of the scheduled engine. 5. </w:t>
       </w:r>
       <w:r>
         <w:rPr>
+          <w:rFonts w:asciiTheme="majorHAnsi" w:hAnsiTheme="majorHAnsi" w:cstheme="majorHAnsi"/>
           <w:b/>
           <w:bCs/>
         </w:rPr>
         <w:t>Group 7 — Payroll Assistant</w:t>
       </w:r>
       <w:r>
+        <w:rPr>
+          <w:rFonts w:asciiTheme="majorHAnsi" w:hAnsiTheme="majorHAnsi" w:cstheme="majorHAnsi"/>
+        </w:rPr>
         <w:t xml:space="preserve"> — independent scheduled document-generation assistant. Its </w:t>
       </w:r>
       <w:r>
         <w:rPr>
+          <w:rFonts w:asciiTheme="majorHAnsi" w:hAnsiTheme="majorHAnsi" w:cstheme="majorHAnsi"/>
           <w:b/>
           <w:bCs/>
         </w:rPr>
         <w:t>email-only</w:t>
       </w:r>
       <w:r>
+        <w:rPr>
+          <w:rFonts w:asciiTheme="majorHAnsi" w:hAnsiTheme="majorHAnsi" w:cstheme="majorHAnsi"/>
+        </w:rPr>
         <w:t xml:space="preserve"> modes are near-term feasible (the payroll generation, </w:t>
       </w:r>
       <w:proofErr w:type="spellStart"/>
       <w:r>
+        <w:rPr>
+          <w:rFonts w:asciiTheme="majorHAnsi" w:hAnsiTheme="majorHAnsi" w:cstheme="majorHAnsi"/>
+        </w:rPr>
         <w:t>finalisation</w:t>
       </w:r>
       <w:proofErr w:type="spellEnd"/>
       <w:r>
+        <w:rPr>
+          <w:rFonts w:asciiTheme="majorHAnsi" w:hAnsiTheme="majorHAnsi" w:cstheme="majorHAnsi"/>
+        </w:rPr>
         <w:t xml:space="preserve">, and </w:t>
       </w:r>
       <w:proofErr w:type="spellStart"/>
       <w:r>
+        <w:rPr>
+          <w:rFonts w:asciiTheme="majorHAnsi" w:hAnsiTheme="majorHAnsi" w:cstheme="majorHAnsi"/>
+        </w:rPr>
         <w:t>payslip</w:t>
       </w:r>
       <w:proofErr w:type="spellEnd"/>
       <w:r>
+        <w:rPr>
+          <w:rFonts w:asciiTheme="majorHAnsi" w:hAnsiTheme="majorHAnsi" w:cstheme="majorHAnsi"/>
+        </w:rPr>
         <w:t xml:space="preserve">-email paths already exist); the </w:t>
       </w:r>
       <w:r>
         <w:rPr>
+          <w:rFonts w:asciiTheme="majorHAnsi" w:hAnsiTheme="majorHAnsi" w:cstheme="majorHAnsi"/>
           <w:b/>
           <w:bCs/>
         </w:rPr>
         <w:t>SMS + secure-link</w:t>
       </w:r>
       <w:r>
+        <w:rPr>
+          <w:rFonts w:asciiTheme="majorHAnsi" w:hAnsiTheme="majorHAnsi" w:cstheme="majorHAnsi"/>
+        </w:rPr>
         <w:t xml:space="preserve"> delivery channel is a separate, heavier, GDPR-sensitive sub-effort to phase on its own. Enterprise-gated.</w:t>
       </w:r>
     </w:p>
     <w:p>
-      <w:r>
+      <w:pPr>
+        <w:rPr>
+          <w:rFonts w:asciiTheme="majorHAnsi" w:hAnsiTheme="majorHAnsi" w:cstheme="majorHAnsi"/>
+        </w:rPr>
+      </w:pPr>
+      <w:r>
+        <w:rPr>
+          <w:rFonts w:asciiTheme="majorHAnsi" w:hAnsiTheme="majorHAnsi" w:cstheme="majorHAnsi"/>
+        </w:rPr>
         <w:t xml:space="preserve">The single most important architectural decision this document captures: **the </w:t>
       </w:r>
       <w:proofErr w:type="spellStart"/>
       <w:r>
         <w:rPr>
           <w:rStyle w:val="VerbatimChar"/>
+          <w:rFonts w:asciiTheme="majorHAnsi" w:hAnsiTheme="majorHAnsi" w:cstheme="majorHAnsi"/>
         </w:rPr>
         <w:t>IPayslipRenderer</w:t>
       </w:r>
       <w:proofErr w:type="spellEnd"/>
       <w:r>
+        <w:rPr>
+          <w:rFonts w:asciiTheme="majorHAnsi" w:hAnsiTheme="majorHAnsi" w:cstheme="majorHAnsi"/>
+        </w:rPr>
         <w:t xml:space="preserve"> + </w:t>
       </w:r>
       <w:proofErr w:type="spellStart"/>
       <w:r>
         <w:rPr>
           <w:rStyle w:val="VerbatimChar"/>
+          <w:rFonts w:asciiTheme="majorHAnsi" w:hAnsiTheme="majorHAnsi" w:cstheme="majorHAnsi"/>
         </w:rPr>
         <w:t>IPayslipPdfService</w:t>
       </w:r>
       <w:proofErr w:type="spellEnd"/>
       <w:r>
+        <w:rPr>
+          <w:rFonts w:asciiTheme="majorHAnsi" w:hAnsiTheme="majorHAnsi" w:cstheme="majorHAnsi"/>
+        </w:rPr>
         <w:t xml:space="preserve"> via </w:t>
       </w:r>
       <w:proofErr w:type="spellStart"/>
       <w:r>
+        <w:rPr>
+          <w:rFonts w:asciiTheme="majorHAnsi" w:hAnsiTheme="majorHAnsi" w:cstheme="majorHAnsi"/>
+        </w:rPr>
         <w:t>PuppeteerSharp</w:t>
       </w:r>
       <w:proofErr w:type="spellEnd"/>
       <w:r>
+        <w:rPr>
+          <w:rFonts w:asciiTheme="majorHAnsi" w:hAnsiTheme="majorHAnsi" w:cstheme="majorHAnsi"/>
+        </w:rPr>
         <w:t xml:space="preserve">, </w:t>
       </w:r>
       <w:proofErr w:type="spellStart"/>
       <w:r>
         <w:rPr>
           <w:rStyle w:val="VerbatimChar"/>
+          <w:rFonts w:asciiTheme="majorHAnsi" w:hAnsiTheme="majorHAnsi" w:cstheme="majorHAnsi"/>
         </w:rPr>
         <w:t>PayrollHub</w:t>
       </w:r>
       <w:proofErr w:type="spellEnd"/>
       <w:r>
+        <w:rPr>
+          <w:rFonts w:asciiTheme="majorHAnsi" w:hAnsiTheme="majorHAnsi" w:cstheme="majorHAnsi"/>
+        </w:rPr>
         <w:t xml:space="preserve"> progress). The assistant is essentially a </w:t>
       </w:r>
       <w:r>
         <w:rPr>
+          <w:rFonts w:asciiTheme="majorHAnsi" w:hAnsiTheme="majorHAnsi" w:cstheme="majorHAnsi"/>
           <w:b/>
           <w:bCs/>
         </w:rPr>
         <w:t>scheduler + orchestrator</w:t>
       </w:r>
       <w:r>
+        <w:rPr>
+          <w:rFonts w:asciiTheme="majorHAnsi" w:hAnsiTheme="majorHAnsi" w:cstheme="majorHAnsi"/>
+        </w:rPr>
         <w:t xml:space="preserve"> on top of that surface, enqueuing delivery through the notification spine.</w:t>
       </w:r>
     </w:p>
     <w:p>
       <w:pPr>
         <w:pStyle w:val="Quote"/>
-      </w:pPr>
-      <w:r>
-        <w:rPr>
+        <w:rPr>
+          <w:rFonts w:asciiTheme="majorHAnsi" w:hAnsiTheme="majorHAnsi" w:cstheme="majorHAnsi"/>
+        </w:rPr>
+      </w:pPr>
+      <w:r>
+        <w:rPr>
+          <w:rFonts w:asciiTheme="majorHAnsi" w:hAnsiTheme="majorHAnsi" w:cstheme="majorHAnsi"/>
           <w:b/>
           <w:bCs/>
         </w:rPr>
         <w:t>Plan gating note:</w:t>
       </w:r>
       <w:r>
+        <w:rPr>
+          <w:rFonts w:asciiTheme="majorHAnsi" w:hAnsiTheme="majorHAnsi" w:cstheme="majorHAnsi"/>
+        </w:rPr>
         <w:t xml:space="preserve"> the </w:t>
       </w:r>
       <w:proofErr w:type="gramStart"/>
       <w:r>
+        <w:rPr>
+          <w:rFonts w:asciiTheme="majorHAnsi" w:hAnsiTheme="majorHAnsi" w:cstheme="majorHAnsi"/>
+        </w:rPr>
         <w:t>Payroll</w:t>
       </w:r>
       <w:proofErr w:type="gramEnd"/>
       <w:r>
+        <w:rPr>
+          <w:rFonts w:asciiTheme="majorHAnsi" w:hAnsiTheme="majorHAnsi" w:cstheme="majorHAnsi"/>
+        </w:rPr>
         <w:t xml:space="preserve"> module is </w:t>
       </w:r>
       <w:r>
         <w:rPr>
+          <w:rFonts w:asciiTheme="majorHAnsi" w:hAnsiTheme="majorHAnsi" w:cstheme="majorHAnsi"/>
           <w:b/>
           <w:bCs/>
         </w:rPr>
         <w:t>Enterprise-only</w:t>
       </w:r>
       <w:r>
+        <w:rPr>
+          <w:rFonts w:asciiTheme="majorHAnsi" w:hAnsiTheme="majorHAnsi" w:cstheme="majorHAnsi"/>
+        </w:rPr>
         <w:t xml:space="preserve"> (</w:t>
       </w:r>
       <w:r>
         <w:rPr>
           <w:rStyle w:val="VerbatimChar"/>
+          <w:rFonts w:asciiTheme="majorHAnsi" w:hAnsiTheme="majorHAnsi" w:cstheme="majorHAnsi"/>
         </w:rPr>
         <w:t>payroll</w:t>
       </w:r>
       <w:r>
+        <w:rPr>
+          <w:rFonts w:asciiTheme="majorHAnsi" w:hAnsiTheme="majorHAnsi" w:cstheme="majorHAnsi"/>
+        </w:rPr>
         <w:t xml:space="preserve"> module key), whereas Digital Assistants is Professional+. The Payroll Assistant therefore requires </w:t>
       </w:r>
       <w:r>
         <w:rPr>
+          <w:rFonts w:asciiTheme="majorHAnsi" w:hAnsiTheme="majorHAnsi" w:cstheme="majorHAnsi"/>
           <w:b/>
           <w:bCs/>
         </w:rPr>
         <w:t>both</w:t>
       </w:r>
       <w:r>
+        <w:rPr>
+          <w:rFonts w:asciiTheme="majorHAnsi" w:hAnsiTheme="majorHAnsi" w:cstheme="majorHAnsi"/>
+        </w:rPr>
         <w:t xml:space="preserve"> </w:t>
       </w:r>
       <w:r>
         <w:rPr>
           <w:rStyle w:val="VerbatimChar"/>
+          <w:rFonts w:asciiTheme="majorHAnsi" w:hAnsiTheme="majorHAnsi" w:cstheme="majorHAnsi"/>
         </w:rPr>
         <w:t>payroll</w:t>
       </w:r>
       <w:r>
+        <w:rPr>
+          <w:rFonts w:asciiTheme="majorHAnsi" w:hAnsiTheme="majorHAnsi" w:cstheme="majorHAnsi"/>
+        </w:rPr>
         <w:t xml:space="preserve"> AND </w:t>
       </w:r>
       <w:proofErr w:type="spellStart"/>
       <w:r>
         <w:rPr>
           <w:rStyle w:val="VerbatimChar"/>
+          <w:rFonts w:asciiTheme="majorHAnsi" w:hAnsiTheme="majorHAnsi" w:cstheme="majorHAnsi"/>
         </w:rPr>
         <w:t>digital_assistants</w:t>
       </w:r>
       <w:proofErr w:type="spellEnd"/>
       <w:r>
+        <w:rPr>
+          <w:rFonts w:asciiTheme="majorHAnsi" w:hAnsiTheme="majorHAnsi" w:cstheme="majorHAnsi"/>
+        </w:rPr>
         <w:t xml:space="preserve"> — effectively Enterprise. Confirm the gating</w:t>
       </w:r>
     </w:p>
@@ -5523,24 +5626,35 @@
           <w:ilvl w:val="0"/>
           <w:numId w:val="10"/>
         </w:numPr>
-      </w:pPr>
-      <w:r>
-        <w:rPr>
+        <w:rPr>
+          <w:rFonts w:asciiTheme="majorHAnsi" w:hAnsiTheme="majorHAnsi" w:cstheme="majorHAnsi"/>
+        </w:rPr>
+      </w:pPr>
+      <w:r>
+        <w:rPr>
+          <w:rFonts w:asciiTheme="majorHAnsi" w:hAnsiTheme="majorHAnsi" w:cstheme="majorHAnsi"/>
           <w:b/>
           <w:bCs/>
         </w:rPr>
         <w:t>Recurring Invoices (Group 6) design:</w:t>
       </w:r>
       <w:r>
+        <w:rPr>
+          <w:rFonts w:asciiTheme="majorHAnsi" w:hAnsiTheme="majorHAnsi" w:cstheme="majorHAnsi"/>
+        </w:rPr>
         <w:t xml:space="preserve"> </w:t>
       </w:r>
       <w:r>
         <w:rPr>
           <w:rStyle w:val="VerbatimChar"/>
+          <w:rFonts w:asciiTheme="majorHAnsi" w:hAnsiTheme="majorHAnsi" w:cstheme="majorHAnsi"/>
         </w:rPr>
         <w:t>design.md</w:t>
       </w:r>
       <w:r>
+        <w:rPr>
+          <w:rFonts w:asciiTheme="majorHAnsi" w:hAnsiTheme="majorHAnsi" w:cstheme="majorHAnsi"/>
+        </w:rPr>
         <w:t xml:space="preserve"> → "Phase 2 — Recurring Invoices Assistant".</w:t>
       </w:r>
     </w:p>
@@ -5551,9 +5665,13 @@
           <w:ilvl w:val="0"/>
           <w:numId w:val="10"/>
         </w:numPr>
-      </w:pPr>
-      <w:r>
-        <w:rPr>
+        <w:rPr>
+          <w:rFonts w:asciiTheme="majorHAnsi" w:hAnsiTheme="majorHAnsi" w:cstheme="majorHAnsi"/>
+        </w:rPr>
+      </w:pPr>
+      <w:r>
+        <w:rPr>
+          <w:rFonts w:asciiTheme="majorHAnsi" w:hAnsiTheme="majorHAnsi" w:cstheme="majorHAnsi"/>
           <w:b/>
           <w:bCs/>
         </w:rPr>
@@ -5562,17 +5680,22 @@
       <w:proofErr w:type="gramStart"/>
       <w:r>
         <w:rPr>
+          <w:rFonts w:asciiTheme="majorHAnsi" w:hAnsiTheme="majorHAnsi" w:cstheme="majorHAnsi"/>
           <w:b/>
           <w:bCs/>
         </w:rPr>
         <w:t>:</w:t>
       </w:r>
       <w:r>
+        <w:rPr>
+          <w:rFonts w:asciiTheme="majorHAnsi" w:hAnsiTheme="majorHAnsi" w:cstheme="majorHAnsi"/>
+        </w:rPr>
         <w:t xml:space="preserve"> </w:t>
       </w:r>
       <w:r>
         <w:rPr>
           <w:rStyle w:val="VerbatimChar"/>
+          <w:rFonts w:asciiTheme="majorHAnsi" w:hAnsiTheme="majorHAnsi" w:cstheme="majorHAnsi"/>
         </w:rPr>
         <w:t>.</w:t>
       </w:r>
@@ -5581,6 +5704,7 @@
       <w:r>
         <w:rPr>
           <w:rStyle w:val="VerbatimChar"/>
+          <w:rFonts w:asciiTheme="majorHAnsi" w:hAnsiTheme="majorHAnsi" w:cstheme="majorHAnsi"/>
         </w:rPr>
         <w:t>kiro</w:t>
       </w:r>
@@ -5588,70 +5712,102 @@
       <w:r>
         <w:rPr>
           <w:rStyle w:val="VerbatimChar"/>
+          <w:rFonts w:asciiTheme="majorHAnsi" w:hAnsiTheme="majorHAnsi" w:cstheme="majorHAnsi"/>
         </w:rPr>
         <w:t>/docs/Payslip_Phases_Timetable.md</w:t>
       </w:r>
       <w:r>
+        <w:rPr>
+          <w:rFonts w:asciiTheme="majorHAnsi" w:hAnsiTheme="majorHAnsi" w:cstheme="majorHAnsi"/>
+        </w:rPr>
         <w:t xml:space="preserve"> (Phases A–D — the fully-built generation, </w:t>
       </w:r>
       <w:proofErr w:type="spellStart"/>
       <w:r>
+        <w:rPr>
+          <w:rFonts w:asciiTheme="majorHAnsi" w:hAnsiTheme="majorHAnsi" w:cstheme="majorHAnsi"/>
+        </w:rPr>
         <w:t>finalisation</w:t>
       </w:r>
       <w:proofErr w:type="spellEnd"/>
       <w:r>
+        <w:rPr>
+          <w:rFonts w:asciiTheme="majorHAnsi" w:hAnsiTheme="majorHAnsi" w:cstheme="majorHAnsi"/>
+        </w:rPr>
         <w:t xml:space="preserve">, PDF, and </w:t>
       </w:r>
       <w:proofErr w:type="spellStart"/>
       <w:r>
+        <w:rPr>
+          <w:rFonts w:asciiTheme="majorHAnsi" w:hAnsiTheme="majorHAnsi" w:cstheme="majorHAnsi"/>
+        </w:rPr>
         <w:t>payslip</w:t>
       </w:r>
       <w:proofErr w:type="spellEnd"/>
       <w:r>
+        <w:rPr>
+          <w:rFonts w:asciiTheme="majorHAnsi" w:hAnsiTheme="majorHAnsi" w:cstheme="majorHAnsi"/>
+        </w:rPr>
         <w:t xml:space="preserve">-email surface the Payroll Assistant schedules). Key services: </w:t>
       </w:r>
       <w:proofErr w:type="spellStart"/>
       <w:r>
         <w:rPr>
           <w:rStyle w:val="VerbatimChar"/>
+          <w:rFonts w:asciiTheme="majorHAnsi" w:hAnsiTheme="majorHAnsi" w:cstheme="majorHAnsi"/>
         </w:rPr>
         <w:t>IPayrollService</w:t>
       </w:r>
       <w:proofErr w:type="spellEnd"/>
       <w:r>
+        <w:rPr>
+          <w:rFonts w:asciiTheme="majorHAnsi" w:hAnsiTheme="majorHAnsi" w:cstheme="majorHAnsi"/>
+        </w:rPr>
         <w:t xml:space="preserve">, </w:t>
       </w:r>
       <w:proofErr w:type="spellStart"/>
       <w:r>
         <w:rPr>
           <w:rStyle w:val="VerbatimChar"/>
+          <w:rFonts w:asciiTheme="majorHAnsi" w:hAnsiTheme="majorHAnsi" w:cstheme="majorHAnsi"/>
         </w:rPr>
         <w:t>IPayslipEmailService</w:t>
       </w:r>
       <w:proofErr w:type="spellEnd"/>
       <w:r>
+        <w:rPr>
+          <w:rFonts w:asciiTheme="majorHAnsi" w:hAnsiTheme="majorHAnsi" w:cstheme="majorHAnsi"/>
+        </w:rPr>
         <w:t xml:space="preserve">, </w:t>
       </w:r>
       <w:proofErr w:type="spellStart"/>
       <w:r>
         <w:rPr>
           <w:rStyle w:val="VerbatimChar"/>
+          <w:rFonts w:asciiTheme="majorHAnsi" w:hAnsiTheme="majorHAnsi" w:cstheme="majorHAnsi"/>
         </w:rPr>
         <w:t>IPayslipRenderer</w:t>
       </w:r>
       <w:proofErr w:type="spellEnd"/>
       <w:r>
+        <w:rPr>
+          <w:rFonts w:asciiTheme="majorHAnsi" w:hAnsiTheme="majorHAnsi" w:cstheme="majorHAnsi"/>
+        </w:rPr>
         <w:t xml:space="preserve"> + </w:t>
       </w:r>
       <w:proofErr w:type="spellStart"/>
       <w:r>
         <w:rPr>
           <w:rStyle w:val="VerbatimChar"/>
+          <w:rFonts w:asciiTheme="majorHAnsi" w:hAnsiTheme="majorHAnsi" w:cstheme="majorHAnsi"/>
         </w:rPr>
         <w:t>IPayslipPdfService</w:t>
       </w:r>
       <w:proofErr w:type="spellEnd"/>
       <w:r>
+        <w:rPr>
+          <w:rFonts w:asciiTheme="majorHAnsi" w:hAnsiTheme="majorHAnsi" w:cstheme="majorHAnsi"/>
+        </w:rPr>
         <w:t>.</w:t>
       </w:r>
     </w:p>
@@ -5662,9 +5818,13 @@
           <w:ilvl w:val="0"/>
           <w:numId w:val="10"/>
         </w:numPr>
-      </w:pPr>
-      <w:r>
-        <w:rPr>
+        <w:rPr>
+          <w:rFonts w:asciiTheme="majorHAnsi" w:hAnsiTheme="majorHAnsi" w:cstheme="majorHAnsi"/>
+        </w:rPr>
+      </w:pPr>
+      <w:r>
+        <w:rPr>
+          <w:rFonts w:asciiTheme="majorHAnsi" w:hAnsiTheme="majorHAnsi" w:cstheme="majorHAnsi"/>
           <w:b/>
           <w:bCs/>
         </w:rPr>
@@ -5673,17 +5833,22 @@
       <w:proofErr w:type="gramStart"/>
       <w:r>
         <w:rPr>
+          <w:rFonts w:asciiTheme="majorHAnsi" w:hAnsiTheme="majorHAnsi" w:cstheme="majorHAnsi"/>
           <w:b/>
           <w:bCs/>
         </w:rPr>
         <w:t>:</w:t>
       </w:r>
       <w:r>
+        <w:rPr>
+          <w:rFonts w:asciiTheme="majorHAnsi" w:hAnsiTheme="majorHAnsi" w:cstheme="majorHAnsi"/>
+        </w:rPr>
         <w:t xml:space="preserve"> </w:t>
       </w:r>
       <w:r>
         <w:rPr>
           <w:rStyle w:val="VerbatimChar"/>
+          <w:rFonts w:asciiTheme="majorHAnsi" w:hAnsiTheme="majorHAnsi" w:cstheme="majorHAnsi"/>
         </w:rPr>
         <w:t>.</w:t>
       </w:r>
@@ -5692,6 +5857,7 @@
       <w:r>
         <w:rPr>
           <w:rStyle w:val="VerbatimChar"/>
+          <w:rFonts w:asciiTheme="majorHAnsi" w:hAnsiTheme="majorHAnsi" w:cstheme="majorHAnsi"/>
         </w:rPr>
         <w:t>kiro</w:t>
       </w:r>
@@ -5699,10 +5865,14 @@
       <w:r>
         <w:rPr>
           <w:rStyle w:val="VerbatimChar"/>
+          <w:rFonts w:asciiTheme="majorHAnsi" w:hAnsiTheme="majorHAnsi" w:cstheme="majorHAnsi"/>
         </w:rPr>
         <w:t>/docs/scenarios/digital-assistants-testing.md</w:t>
       </w:r>
       <w:r>
+        <w:rPr>
+          <w:rFonts w:asciiTheme="majorHAnsi" w:hAnsiTheme="majorHAnsi" w:cstheme="majorHAnsi"/>
+        </w:rPr>
         <w:t>.</w:t>
       </w:r>
     </w:p>
@@ -5713,9 +5883,13 @@
           <w:ilvl w:val="0"/>
           <w:numId w:val="10"/>
         </w:numPr>
-      </w:pPr>
-      <w:r>
-        <w:rPr>
+        <w:rPr>
+          <w:rFonts w:asciiTheme="majorHAnsi" w:hAnsiTheme="majorHAnsi" w:cstheme="majorHAnsi"/>
+        </w:rPr>
+      </w:pPr>
+      <w:r>
+        <w:rPr>
+          <w:rFonts w:asciiTheme="majorHAnsi" w:hAnsiTheme="majorHAnsi" w:cstheme="majorHAnsi"/>
           <w:b/>
           <w:bCs/>
         </w:rPr>
@@ -5724,17 +5898,22 @@
       <w:proofErr w:type="gramStart"/>
       <w:r>
         <w:rPr>
+          <w:rFonts w:asciiTheme="majorHAnsi" w:hAnsiTheme="majorHAnsi" w:cstheme="majorHAnsi"/>
           <w:b/>
           <w:bCs/>
         </w:rPr>
         <w:t>:</w:t>
       </w:r>
       <w:r>
+        <w:rPr>
+          <w:rFonts w:asciiTheme="majorHAnsi" w:hAnsiTheme="majorHAnsi" w:cstheme="majorHAnsi"/>
+        </w:rPr>
         <w:t xml:space="preserve"> </w:t>
       </w:r>
       <w:r>
         <w:rPr>
           <w:rStyle w:val="VerbatimChar"/>
+          <w:rFonts w:asciiTheme="majorHAnsi" w:hAnsiTheme="majorHAnsi" w:cstheme="majorHAnsi"/>
         </w:rPr>
         <w:t>.</w:t>
       </w:r>
@@ -5743,6 +5922,7 @@
       <w:r>
         <w:rPr>
           <w:rStyle w:val="VerbatimChar"/>
+          <w:rFonts w:asciiTheme="majorHAnsi" w:hAnsiTheme="majorHAnsi" w:cstheme="majorHAnsi"/>
         </w:rPr>
         <w:t>kiro</w:t>
       </w:r>
@@ -5750,16 +5930,21 @@
       <w:r>
         <w:rPr>
           <w:rStyle w:val="VerbatimChar"/>
+          <w:rFonts w:asciiTheme="majorHAnsi" w:hAnsiTheme="majorHAnsi" w:cstheme="majorHAnsi"/>
         </w:rPr>
         <w:t>/docs/Subscription_Tier_Model.md</w:t>
       </w:r>
       <w:r>
+        <w:rPr>
+          <w:rFonts w:asciiTheme="majorHAnsi" w:hAnsiTheme="majorHAnsi" w:cstheme="majorHAnsi"/>
+        </w:rPr>
         <w:t xml:space="preserve"> (</w:t>
       </w:r>
       <w:proofErr w:type="spellStart"/>
       <w:r>
         <w:rPr>
           <w:rStyle w:val="VerbatimChar"/>
+          <w:rFonts w:asciiTheme="majorHAnsi" w:hAnsiTheme="majorHAnsi" w:cstheme="majorHAnsi"/>
         </w:rPr>
         <w:t>digital_</w:t>
       </w:r>
@@ -5767,37 +5952,50 @@
       <w:r>
         <w:rPr>
           <w:rStyle w:val="VerbatimChar"/>
+          <w:rFonts w:asciiTheme="majorHAnsi" w:hAnsiTheme="majorHAnsi" w:cstheme="majorHAnsi"/>
         </w:rPr>
         <w:t>assistants</w:t>
       </w:r>
       <w:proofErr w:type="spellEnd"/>
       <w:proofErr w:type="gramEnd"/>
       <w:r>
+        <w:rPr>
+          <w:rFonts w:asciiTheme="majorHAnsi" w:hAnsiTheme="majorHAnsi" w:cstheme="majorHAnsi"/>
+        </w:rPr>
         <w:t xml:space="preserve"> module — Professional+; the Payroll Assistant additionally requires the Enterprise-only </w:t>
       </w:r>
       <w:r>
         <w:rPr>
           <w:rStyle w:val="VerbatimChar"/>
+          <w:rFonts w:asciiTheme="majorHAnsi" w:hAnsiTheme="majorHAnsi" w:cstheme="majorHAnsi"/>
         </w:rPr>
         <w:t>payroll</w:t>
       </w:r>
       <w:r>
+        <w:rPr>
+          <w:rFonts w:asciiTheme="majorHAnsi" w:hAnsiTheme="majorHAnsi" w:cstheme="majorHAnsi"/>
+        </w:rPr>
         <w:t xml:space="preserve"> module). On the configured day/time, the assistant opens the month's </w:t>
       </w:r>
       <w:proofErr w:type="spellStart"/>
       <w:r>
         <w:rPr>
           <w:rStyle w:val="VerbatimChar"/>
+          <w:rFonts w:asciiTheme="majorHAnsi" w:hAnsiTheme="majorHAnsi" w:cstheme="majorHAnsi"/>
         </w:rPr>
         <w:t>PayslipPeriod</w:t>
       </w:r>
       <w:proofErr w:type="spellEnd"/>
       <w:r>
+        <w:rPr>
+          <w:rFonts w:asciiTheme="majorHAnsi" w:hAnsiTheme="majorHAnsi" w:cstheme="majorHAnsi"/>
+        </w:rPr>
         <w:t xml:space="preserve"> (guarded by the existing </w:t>
       </w:r>
       <w:r>
         <w:rPr>
           <w:rStyle w:val="VerbatimChar"/>
+          <w:rFonts w:asciiTheme="majorHAnsi" w:hAnsiTheme="majorHAnsi" w:cstheme="majorHAnsi"/>
         </w:rPr>
         <w:t>(</w:t>
       </w:r>
@@ -5805,6 +6003,7 @@
       <w:r>
         <w:rPr>
           <w:rStyle w:val="VerbatimChar"/>
+          <w:rFonts w:asciiTheme="majorHAnsi" w:hAnsiTheme="majorHAnsi" w:cstheme="majorHAnsi"/>
         </w:rPr>
         <w:t>BusinessId</w:t>
       </w:r>
@@ -5812,47 +6011,59 @@
       <w:r>
         <w:rPr>
           <w:rStyle w:val="VerbatimChar"/>
+          <w:rFonts w:asciiTheme="majorHAnsi" w:hAnsiTheme="majorHAnsi" w:cstheme="majorHAnsi"/>
         </w:rPr>
         <w:t>, Year, Month)</w:t>
       </w:r>
       <w:r>
+        <w:rPr>
+          <w:rFonts w:asciiTheme="majorHAnsi" w:hAnsiTheme="majorHAnsi" w:cstheme="majorHAnsi"/>
+        </w:rPr>
         <w:t xml:space="preserve"> uniqueness + </w:t>
       </w:r>
       <w:proofErr w:type="spellStart"/>
       <w:r>
         <w:rPr>
           <w:rStyle w:val="VerbatimChar"/>
+          <w:rFonts w:asciiTheme="majorHAnsi" w:hAnsiTheme="majorHAnsi" w:cstheme="majorHAnsi"/>
         </w:rPr>
         <w:t>PeriodExistsAsync</w:t>
       </w:r>
       <w:proofErr w:type="spellEnd"/>
       <w:r>
-        <w:t xml:space="preserve">), runs batch generation </w:t>
-      </w:r>
-      <w:r>
-        <w:lastRenderedPageBreak/>
-        <w:t>(</w:t>
+        <w:rPr>
+          <w:rFonts w:asciiTheme="majorHAnsi" w:hAnsiTheme="majorHAnsi" w:cstheme="majorHAnsi"/>
+        </w:rPr>
+        <w:t>), runs batch generation (</w:t>
       </w:r>
       <w:proofErr w:type="spellStart"/>
       <w:r>
         <w:rPr>
           <w:rStyle w:val="VerbatimChar"/>
+          <w:rFonts w:asciiTheme="majorHAnsi" w:hAnsiTheme="majorHAnsi" w:cstheme="majorHAnsi"/>
         </w:rPr>
         <w:t>GeneratePayslipsPreviewAsync</w:t>
       </w:r>
       <w:proofErr w:type="spellEnd"/>
       <w:r>
+        <w:rPr>
+          <w:rFonts w:asciiTheme="majorHAnsi" w:hAnsiTheme="majorHAnsi" w:cstheme="majorHAnsi"/>
+        </w:rPr>
         <w:t xml:space="preserve"> → </w:t>
       </w:r>
       <w:proofErr w:type="spellStart"/>
       <w:r>
         <w:rPr>
           <w:rStyle w:val="VerbatimChar"/>
+          <w:rFonts w:asciiTheme="majorHAnsi" w:hAnsiTheme="majorHAnsi" w:cstheme="majorHAnsi"/>
         </w:rPr>
         <w:t>ConfirmBatchGenerationAsync</w:t>
       </w:r>
       <w:proofErr w:type="spellEnd"/>
       <w:r>
+        <w:rPr>
+          <w:rFonts w:asciiTheme="majorHAnsi" w:hAnsiTheme="majorHAnsi" w:cstheme="majorHAnsi"/>
+        </w:rPr>
         <w:t>), and then follows the owner's configured sub-option:</w:t>
       </w:r>
     </w:p>
@@ -5863,23 +6074,36 @@
           <w:ilvl w:val="0"/>
           <w:numId w:val="10"/>
         </w:numPr>
-      </w:pPr>
-      <w:r>
-        <w:rPr>
+        <w:rPr>
+          <w:rFonts w:asciiTheme="majorHAnsi" w:hAnsiTheme="majorHAnsi" w:cstheme="majorHAnsi"/>
+        </w:rPr>
+      </w:pPr>
+      <w:r>
+        <w:rPr>
+          <w:rFonts w:asciiTheme="majorHAnsi" w:hAnsiTheme="majorHAnsi" w:cstheme="majorHAnsi"/>
           <w:b/>
           <w:bCs/>
         </w:rPr>
         <w:t>Generate only</w:t>
       </w:r>
       <w:r>
+        <w:rPr>
+          <w:rFonts w:asciiTheme="majorHAnsi" w:hAnsiTheme="majorHAnsi" w:cstheme="majorHAnsi"/>
+        </w:rPr>
         <w:t xml:space="preserve"> → leave </w:t>
       </w:r>
       <w:proofErr w:type="spellStart"/>
       <w:r>
+        <w:rPr>
+          <w:rFonts w:asciiTheme="majorHAnsi" w:hAnsiTheme="majorHAnsi" w:cstheme="majorHAnsi"/>
+        </w:rPr>
         <w:t>payslips</w:t>
       </w:r>
       <w:proofErr w:type="spellEnd"/>
       <w:r>
+        <w:rPr>
+          <w:rFonts w:asciiTheme="majorHAnsi" w:hAnsiTheme="majorHAnsi" w:cstheme="majorHAnsi"/>
+        </w:rPr>
         <w:t xml:space="preserve"> in Preview, notify the owner "payroll for {month} generated and awaiting your review."</w:t>
       </w:r>
     </w:p>
@@ -5890,40 +6114,67 @@
           <w:ilvl w:val="0"/>
           <w:numId w:val="10"/>
         </w:numPr>
-      </w:pPr>
-      <w:r>
-        <w:rPr>
-          <w:b/>
-          <w:bCs/>
-        </w:rPr>
+        <w:rPr>
+          <w:rFonts w:asciiTheme="majorHAnsi" w:hAnsiTheme="majorHAnsi" w:cstheme="majorHAnsi"/>
+        </w:rPr>
+      </w:pPr>
+      <w:r>
+        <w:rPr>
+          <w:rFonts w:asciiTheme="majorHAnsi" w:hAnsiTheme="majorHAnsi" w:cstheme="majorHAnsi"/>
+          <w:b/>
+          <w:bCs/>
+        </w:rPr>
+        <w:lastRenderedPageBreak/>
         <w:t>Generate + send</w:t>
       </w:r>
       <w:r>
+        <w:rPr>
+          <w:rFonts w:asciiTheme="majorHAnsi" w:hAnsiTheme="majorHAnsi" w:cstheme="majorHAnsi"/>
+        </w:rPr>
         <w:t xml:space="preserve"> → additionally deliver </w:t>
       </w:r>
       <w:proofErr w:type="spellStart"/>
       <w:r>
+        <w:rPr>
+          <w:rFonts w:asciiTheme="majorHAnsi" w:hAnsiTheme="majorHAnsi" w:cstheme="majorHAnsi"/>
+        </w:rPr>
         <w:t>payslips</w:t>
       </w:r>
       <w:proofErr w:type="spellEnd"/>
       <w:r>
+        <w:rPr>
+          <w:rFonts w:asciiTheme="majorHAnsi" w:hAnsiTheme="majorHAnsi" w:cstheme="majorHAnsi"/>
+        </w:rPr>
         <w:t xml:space="preserve"> (see delivery channels) on a configured date/time.</w:t>
       </w:r>
     </w:p>
     <w:p>
       <w:pPr>
         <w:pStyle w:val="Quote"/>
-      </w:pPr>
-      <w:r>
-        <w:rPr>
-          <w:b/>
-          <w:bCs/>
-        </w:rPr>
-        <w:t xml:space="preserve">⚠️ </w:t>
+        <w:rPr>
+          <w:rFonts w:asciiTheme="majorHAnsi" w:hAnsiTheme="majorHAnsi" w:cstheme="majorHAnsi"/>
+        </w:rPr>
+      </w:pPr>
+      <w:r>
+        <w:rPr>
+          <w:rFonts w:ascii="Segoe UI Emoji" w:hAnsi="Segoe UI Emoji" w:cs="Segoe UI Emoji"/>
+          <w:b/>
+          <w:bCs/>
+        </w:rPr>
+        <w:t>⚠️</w:t>
+      </w:r>
+      <w:r>
+        <w:rPr>
+          <w:rFonts w:asciiTheme="majorHAnsi" w:hAnsiTheme="majorHAnsi" w:cstheme="majorHAnsi"/>
+          <w:b/>
+          <w:bCs/>
+        </w:rPr>
+        <w:t xml:space="preserve"> </w:t>
       </w:r>
       <w:proofErr w:type="spellStart"/>
       <w:r>
         <w:rPr>
+          <w:rFonts w:asciiTheme="majorHAnsi" w:hAnsiTheme="majorHAnsi" w:cstheme="majorHAnsi"/>
           <w:b/>
           <w:bCs/>
         </w:rPr>
@@ -5932,35 +6183,50 @@
       <w:proofErr w:type="spellEnd"/>
       <w:r>
         <w:rPr>
+          <w:rFonts w:asciiTheme="majorHAnsi" w:hAnsiTheme="majorHAnsi" w:cstheme="majorHAnsi"/>
           <w:b/>
           <w:bCs/>
         </w:rPr>
         <w:t xml:space="preserve"> decision (must resolve at spec time):</w:t>
       </w:r>
       <w:r>
+        <w:rPr>
+          <w:rFonts w:asciiTheme="majorHAnsi" w:hAnsiTheme="majorHAnsi" w:cstheme="majorHAnsi"/>
+        </w:rPr>
         <w:t xml:space="preserve"> today </w:t>
       </w:r>
       <w:proofErr w:type="spellStart"/>
       <w:r>
+        <w:rPr>
+          <w:rFonts w:asciiTheme="majorHAnsi" w:hAnsiTheme="majorHAnsi" w:cstheme="majorHAnsi"/>
+        </w:rPr>
         <w:t>payslips</w:t>
       </w:r>
       <w:proofErr w:type="spellEnd"/>
       <w:r>
+        <w:rPr>
+          <w:rFonts w:asciiTheme="majorHAnsi" w:hAnsiTheme="majorHAnsi" w:cstheme="majorHAnsi"/>
+        </w:rPr>
         <w:t xml:space="preserve"> only </w:t>
       </w:r>
       <w:r>
         <w:rPr>
+          <w:rFonts w:asciiTheme="majorHAnsi" w:hAnsiTheme="majorHAnsi" w:cstheme="majorHAnsi"/>
           <w:i/>
           <w:iCs/>
         </w:rPr>
         <w:t>send</w:t>
       </w:r>
       <w:r>
+        <w:rPr>
+          <w:rFonts w:asciiTheme="majorHAnsi" w:hAnsiTheme="majorHAnsi" w:cstheme="majorHAnsi"/>
+        </w:rPr>
         <w:t xml:space="preserve"> when </w:t>
       </w:r>
       <w:proofErr w:type="spellStart"/>
       <w:r>
         <w:rPr>
+          <w:rFonts w:asciiTheme="majorHAnsi" w:hAnsiTheme="majorHAnsi" w:cstheme="majorHAnsi"/>
           <w:b/>
           <w:bCs/>
         </w:rPr>
@@ -5968,95 +6234,155 @@
       </w:r>
       <w:proofErr w:type="spellEnd"/>
       <w:r>
+        <w:rPr>
+          <w:rFonts w:asciiTheme="majorHAnsi" w:hAnsiTheme="majorHAnsi" w:cstheme="majorHAnsi"/>
+        </w:rPr>
         <w:t xml:space="preserve"> (status 3/5), and </w:t>
       </w:r>
       <w:proofErr w:type="spellStart"/>
       <w:r>
+        <w:rPr>
+          <w:rFonts w:asciiTheme="majorHAnsi" w:hAnsiTheme="majorHAnsi" w:cstheme="majorHAnsi"/>
+        </w:rPr>
         <w:t>finalisation</w:t>
       </w:r>
       <w:proofErr w:type="spellEnd"/>
       <w:r>
+        <w:rPr>
+          <w:rFonts w:asciiTheme="majorHAnsi" w:hAnsiTheme="majorHAnsi" w:cstheme="majorHAnsi"/>
+        </w:rPr>
         <w:t xml:space="preserve"> creates </w:t>
       </w:r>
       <w:r>
         <w:rPr>
+          <w:rFonts w:asciiTheme="majorHAnsi" w:hAnsiTheme="majorHAnsi" w:cstheme="majorHAnsi"/>
           <w:b/>
           <w:bCs/>
         </w:rPr>
         <w:t>P&amp;L entries</w:t>
       </w:r>
       <w:r>
+        <w:rPr>
+          <w:rFonts w:asciiTheme="majorHAnsi" w:hAnsiTheme="majorHAnsi" w:cstheme="majorHAnsi"/>
+        </w:rPr>
         <w:t xml:space="preserve"> and feeds the </w:t>
       </w:r>
       <w:r>
         <w:rPr>
+          <w:rFonts w:asciiTheme="majorHAnsi" w:hAnsiTheme="majorHAnsi" w:cstheme="majorHAnsi"/>
           <w:b/>
           <w:bCs/>
         </w:rPr>
         <w:t>compliance filing</w:t>
       </w:r>
       <w:r>
+        <w:rPr>
+          <w:rFonts w:asciiTheme="majorHAnsi" w:hAnsiTheme="majorHAnsi" w:cstheme="majorHAnsi"/>
+        </w:rPr>
         <w:t>. Auto-</w:t>
       </w:r>
       <w:proofErr w:type="spellStart"/>
       <w:r>
+        <w:rPr>
+          <w:rFonts w:asciiTheme="majorHAnsi" w:hAnsiTheme="majorHAnsi" w:cstheme="majorHAnsi"/>
+        </w:rPr>
         <w:t>finalising</w:t>
       </w:r>
       <w:proofErr w:type="spellEnd"/>
       <w:r>
+        <w:rPr>
+          <w:rFonts w:asciiTheme="majorHAnsi" w:hAnsiTheme="majorHAnsi" w:cstheme="majorHAnsi"/>
+        </w:rPr>
         <w:t xml:space="preserve"> without a </w:t>
       </w:r>
       <w:proofErr w:type="gramStart"/>
       <w:r>
+        <w:rPr>
+          <w:rFonts w:asciiTheme="majorHAnsi" w:hAnsiTheme="majorHAnsi" w:cstheme="majorHAnsi"/>
+        </w:rPr>
         <w:t>human check risks</w:t>
       </w:r>
       <w:proofErr w:type="gramEnd"/>
       <w:r>
+        <w:rPr>
+          <w:rFonts w:asciiTheme="majorHAnsi" w:hAnsiTheme="majorHAnsi" w:cstheme="majorHAnsi"/>
+        </w:rPr>
         <w:t xml:space="preserve"> pushing wrong figures into P&amp;L. </w:t>
       </w:r>
       <w:proofErr w:type="gramStart"/>
       <w:r>
+        <w:rPr>
+          <w:rFonts w:asciiTheme="majorHAnsi" w:hAnsiTheme="majorHAnsi" w:cstheme="majorHAnsi"/>
+        </w:rPr>
         <w:t>So</w:t>
       </w:r>
       <w:proofErr w:type="gramEnd"/>
       <w:r>
+        <w:rPr>
+          <w:rFonts w:asciiTheme="majorHAnsi" w:hAnsiTheme="majorHAnsi" w:cstheme="majorHAnsi"/>
+        </w:rPr>
         <w:t xml:space="preserve"> Mode 1 needs an explicit decision: (a) auto-</w:t>
       </w:r>
       <w:proofErr w:type="spellStart"/>
       <w:r>
+        <w:rPr>
+          <w:rFonts w:asciiTheme="majorHAnsi" w:hAnsiTheme="majorHAnsi" w:cstheme="majorHAnsi"/>
+        </w:rPr>
         <w:t>finalise</w:t>
       </w:r>
       <w:proofErr w:type="spellEnd"/>
       <w:r>
+        <w:rPr>
+          <w:rFonts w:asciiTheme="majorHAnsi" w:hAnsiTheme="majorHAnsi" w:cstheme="majorHAnsi"/>
+        </w:rPr>
         <w:t xml:space="preserve"> then send (fully autonomous, higher risk), or (b) generate-to-Preview and </w:t>
       </w:r>
       <w:r>
         <w:rPr>
+          <w:rFonts w:asciiTheme="majorHAnsi" w:hAnsiTheme="majorHAnsi" w:cstheme="majorHAnsi"/>
           <w:b/>
           <w:bCs/>
         </w:rPr>
         <w:t>require owner approval</w:t>
       </w:r>
       <w:r>
+        <w:rPr>
+          <w:rFonts w:asciiTheme="majorHAnsi" w:hAnsiTheme="majorHAnsi" w:cstheme="majorHAnsi"/>
+        </w:rPr>
         <w:t xml:space="preserve"> before </w:t>
       </w:r>
       <w:proofErr w:type="spellStart"/>
       <w:proofErr w:type="gramStart"/>
       <w:r>
+        <w:rPr>
+          <w:rFonts w:asciiTheme="majorHAnsi" w:hAnsiTheme="majorHAnsi" w:cstheme="majorHAnsi"/>
+        </w:rPr>
         <w:t>finalise</w:t>
       </w:r>
       <w:proofErr w:type="gramEnd"/>
       <w:r>
+        <w:rPr>
+          <w:rFonts w:asciiTheme="majorHAnsi" w:hAnsiTheme="majorHAnsi" w:cstheme="majorHAnsi"/>
+        </w:rPr>
         <w:t>+send</w:t>
       </w:r>
       <w:proofErr w:type="spellEnd"/>
       <w:r>
+        <w:rPr>
+          <w:rFonts w:asciiTheme="majorHAnsi" w:hAnsiTheme="majorHAnsi" w:cstheme="majorHAnsi"/>
+        </w:rPr>
         <w:t xml:space="preserve"> (safer, recommended default). This is the single biggest product decision for this assistant.</w:t>
       </w:r>
     </w:p>
     <w:p>
-      <w:r>
-        <w:rPr>
+      <w:pPr>
+        <w:rPr>
+          <w:rFonts w:asciiTheme="majorHAnsi" w:hAnsiTheme="majorHAnsi" w:cstheme="majorHAnsi"/>
+        </w:rPr>
+      </w:pPr>
+      <w:r>
+        <w:rPr>
+          <w:rFonts w:asciiTheme="majorHAnsi" w:hAnsiTheme="majorHAnsi" w:cstheme="majorHAnsi"/>
           <w:b/>
           <w:bCs/>
         </w:rPr>
@@ -6065,6 +6391,7 @@
       <w:proofErr w:type="spellStart"/>
       <w:r>
         <w:rPr>
+          <w:rFonts w:asciiTheme="majorHAnsi" w:hAnsiTheme="majorHAnsi" w:cstheme="majorHAnsi"/>
           <w:b/>
           <w:bCs/>
         </w:rPr>
@@ -6073,17 +6400,22 @@
       <w:proofErr w:type="spellEnd"/>
       <w:r>
         <w:rPr>
+          <w:rFonts w:asciiTheme="majorHAnsi" w:hAnsiTheme="majorHAnsi" w:cstheme="majorHAnsi"/>
           <w:b/>
           <w:bCs/>
         </w:rPr>
         <w:t xml:space="preserve"> only:</w:t>
       </w:r>
       <w:r>
+        <w:rPr>
+          <w:rFonts w:asciiTheme="majorHAnsi" w:hAnsiTheme="majorHAnsi" w:cstheme="majorHAnsi"/>
+        </w:rPr>
         <w:t xml:space="preserve"> On the configured day/time, if the period is </w:t>
       </w:r>
       <w:proofErr w:type="spellStart"/>
       <w:r>
         <w:rPr>
+          <w:rFonts w:asciiTheme="majorHAnsi" w:hAnsiTheme="majorHAnsi" w:cstheme="majorHAnsi"/>
           <w:b/>
           <w:bCs/>
         </w:rPr>
@@ -6091,71 +6423,110 @@
       </w:r>
       <w:proofErr w:type="spellEnd"/>
       <w:r>
+        <w:rPr>
+          <w:rFonts w:asciiTheme="majorHAnsi" w:hAnsiTheme="majorHAnsi" w:cstheme="majorHAnsi"/>
+        </w:rPr>
         <w:t xml:space="preserve">, batch-send via the existing </w:t>
       </w:r>
       <w:proofErr w:type="spellStart"/>
       <w:r>
         <w:rPr>
           <w:rStyle w:val="VerbatimChar"/>
+          <w:rFonts w:asciiTheme="majorHAnsi" w:hAnsiTheme="majorHAnsi" w:cstheme="majorHAnsi"/>
         </w:rPr>
         <w:t>SendAllPayslipsAsync</w:t>
       </w:r>
       <w:proofErr w:type="spellEnd"/>
       <w:r>
+        <w:rPr>
+          <w:rFonts w:asciiTheme="majorHAnsi" w:hAnsiTheme="majorHAnsi" w:cstheme="majorHAnsi"/>
+        </w:rPr>
         <w:t xml:space="preserve"> (reused as-is: email-with-PDF, skip-no-email, throttled, logged). If the period is </w:t>
       </w:r>
       <w:r>
         <w:rPr>
+          <w:rFonts w:asciiTheme="majorHAnsi" w:hAnsiTheme="majorHAnsi" w:cstheme="majorHAnsi"/>
           <w:b/>
           <w:bCs/>
         </w:rPr>
         <w:t>not</w:t>
       </w:r>
       <w:r>
+        <w:rPr>
+          <w:rFonts w:asciiTheme="majorHAnsi" w:hAnsiTheme="majorHAnsi" w:cstheme="majorHAnsi"/>
+        </w:rPr>
         <w:t xml:space="preserve"> </w:t>
       </w:r>
       <w:proofErr w:type="spellStart"/>
       <w:r>
+        <w:rPr>
+          <w:rFonts w:asciiTheme="majorHAnsi" w:hAnsiTheme="majorHAnsi" w:cstheme="majorHAnsi"/>
+        </w:rPr>
         <w:t>finalised</w:t>
       </w:r>
       <w:proofErr w:type="spellEnd"/>
       <w:r>
+        <w:rPr>
+          <w:rFonts w:asciiTheme="majorHAnsi" w:hAnsiTheme="majorHAnsi" w:cstheme="majorHAnsi"/>
+        </w:rPr>
         <w:t xml:space="preserve">, send </w:t>
       </w:r>
       <w:r>
         <w:rPr>
+          <w:rFonts w:asciiTheme="majorHAnsi" w:hAnsiTheme="majorHAnsi" w:cstheme="majorHAnsi"/>
           <w:b/>
           <w:bCs/>
         </w:rPr>
         <w:t>no</w:t>
       </w:r>
       <w:r>
+        <w:rPr>
+          <w:rFonts w:asciiTheme="majorHAnsi" w:hAnsiTheme="majorHAnsi" w:cstheme="majorHAnsi"/>
+        </w:rPr>
         <w:t xml:space="preserve"> </w:t>
       </w:r>
       <w:proofErr w:type="spellStart"/>
       <w:proofErr w:type="gramStart"/>
       <w:r>
+        <w:rPr>
+          <w:rFonts w:asciiTheme="majorHAnsi" w:hAnsiTheme="majorHAnsi" w:cstheme="majorHAnsi"/>
+        </w:rPr>
         <w:t>payslips</w:t>
       </w:r>
       <w:proofErr w:type="spellEnd"/>
       <w:proofErr w:type="gramEnd"/>
       <w:r>
+        <w:rPr>
+          <w:rFonts w:asciiTheme="majorHAnsi" w:hAnsiTheme="majorHAnsi" w:cstheme="majorHAnsi"/>
+        </w:rPr>
         <w:t xml:space="preserve"> and instead notify the owner "payroll for {month} is still pending — generate and </w:t>
       </w:r>
       <w:proofErr w:type="spellStart"/>
       <w:r>
+        <w:rPr>
+          <w:rFonts w:asciiTheme="majorHAnsi" w:hAnsiTheme="majorHAnsi" w:cstheme="majorHAnsi"/>
+        </w:rPr>
         <w:t>finalise</w:t>
       </w:r>
       <w:proofErr w:type="spellEnd"/>
       <w:r>
+        <w:rPr>
+          <w:rFonts w:asciiTheme="majorHAnsi" w:hAnsiTheme="majorHAnsi" w:cstheme="majorHAnsi"/>
+        </w:rPr>
         <w:t xml:space="preserve"> it to enable sending."</w:t>
       </w:r>
     </w:p>
     <w:p>
       <w:pPr>
         <w:pStyle w:val="Heading4"/>
-      </w:pPr>
-      <w:r>
+        <w:rPr>
+          <w:rFonts w:cstheme="majorHAnsi"/>
+        </w:rPr>
+      </w:pPr>
+      <w:r>
+        <w:rPr>
+          <w:rFonts w:cstheme="majorHAnsi"/>
+        </w:rPr>
         <w:t>Delivery channels (per-business config)</w:t>
       </w:r>
     </w:p>
@@ -6166,37 +6537,52 @@
           <w:ilvl w:val="0"/>
           <w:numId w:val="11"/>
         </w:numPr>
-      </w:pPr>
-      <w:r>
-        <w:rPr>
+        <w:rPr>
+          <w:rFonts w:asciiTheme="majorHAnsi" w:hAnsiTheme="majorHAnsi" w:cstheme="majorHAnsi"/>
+        </w:rPr>
+      </w:pPr>
+      <w:r>
+        <w:rPr>
+          <w:rFonts w:asciiTheme="majorHAnsi" w:hAnsiTheme="majorHAnsi" w:cstheme="majorHAnsi"/>
           <w:b/>
           <w:bCs/>
         </w:rPr>
         <w:t>Email (exists today):</w:t>
       </w:r>
       <w:r>
+        <w:rPr>
+          <w:rFonts w:asciiTheme="majorHAnsi" w:hAnsiTheme="majorHAnsi" w:cstheme="majorHAnsi"/>
+        </w:rPr>
         <w:t xml:space="preserve"> reuse </w:t>
       </w:r>
       <w:proofErr w:type="spellStart"/>
       <w:r>
         <w:rPr>
           <w:rStyle w:val="VerbatimChar"/>
+          <w:rFonts w:asciiTheme="majorHAnsi" w:hAnsiTheme="majorHAnsi" w:cstheme="majorHAnsi"/>
         </w:rPr>
         <w:t>IPayslipEmailService.SendAllPayslipsAsync</w:t>
       </w:r>
       <w:proofErr w:type="spellEnd"/>
       <w:r>
+        <w:rPr>
+          <w:rFonts w:asciiTheme="majorHAnsi" w:hAnsiTheme="majorHAnsi" w:cstheme="majorHAnsi"/>
+        </w:rPr>
         <w:t xml:space="preserve"> — HTML→PDF attachment, per-send log (</w:t>
       </w:r>
       <w:proofErr w:type="spellStart"/>
       <w:r>
         <w:rPr>
           <w:rStyle w:val="VerbatimChar"/>
+          <w:rFonts w:asciiTheme="majorHAnsi" w:hAnsiTheme="majorHAnsi" w:cstheme="majorHAnsi"/>
         </w:rPr>
         <w:t>PayslipEmailLog</w:t>
       </w:r>
       <w:proofErr w:type="spellEnd"/>
       <w:r>
+        <w:rPr>
+          <w:rFonts w:asciiTheme="majorHAnsi" w:hAnsiTheme="majorHAnsi" w:cstheme="majorHAnsi"/>
+        </w:rPr>
         <w:t>), throttling. Lowest effort.</w:t>
       </w:r>
     </w:p>
@@ -6207,9 +6593,13 @@
           <w:ilvl w:val="0"/>
           <w:numId w:val="11"/>
         </w:numPr>
-      </w:pPr>
-      <w:r>
-        <w:rPr>
+        <w:rPr>
+          <w:rFonts w:asciiTheme="majorHAnsi" w:hAnsiTheme="majorHAnsi" w:cstheme="majorHAnsi"/>
+        </w:rPr>
+      </w:pPr>
+      <w:r>
+        <w:rPr>
+          <w:rFonts w:asciiTheme="majorHAnsi" w:hAnsiTheme="majorHAnsi" w:cstheme="majorHAnsi"/>
           <w:b/>
           <w:bCs/>
         </w:rPr>
@@ -6218,6 +6608,7 @@
       <w:proofErr w:type="spellStart"/>
       <w:r>
         <w:rPr>
+          <w:rFonts w:asciiTheme="majorHAnsi" w:hAnsiTheme="majorHAnsi" w:cstheme="majorHAnsi"/>
           <w:b/>
           <w:bCs/>
         </w:rPr>
@@ -6226,37 +6617,50 @@
       <w:proofErr w:type="spellEnd"/>
       <w:r>
         <w:rPr>
+          <w:rFonts w:asciiTheme="majorHAnsi" w:hAnsiTheme="majorHAnsi" w:cstheme="majorHAnsi"/>
           <w:b/>
           <w:bCs/>
         </w:rPr>
         <w:t xml:space="preserve"> link (NEW, heaviest, GDPR-sensitive):</w:t>
       </w:r>
       <w:r>
+        <w:rPr>
+          <w:rFonts w:asciiTheme="majorHAnsi" w:hAnsiTheme="majorHAnsi" w:cstheme="majorHAnsi"/>
+        </w:rPr>
         <w:t xml:space="preserve"> an optional channel where instead of (or alongside) the emailed PDF, the employee receives an </w:t>
       </w:r>
       <w:r>
         <w:rPr>
+          <w:rFonts w:asciiTheme="majorHAnsi" w:hAnsiTheme="majorHAnsi" w:cstheme="majorHAnsi"/>
           <w:b/>
           <w:bCs/>
         </w:rPr>
         <w:t>SMS</w:t>
       </w:r>
       <w:r>
+        <w:rPr>
+          <w:rFonts w:asciiTheme="majorHAnsi" w:hAnsiTheme="majorHAnsi" w:cstheme="majorHAnsi"/>
+        </w:rPr>
         <w:t xml:space="preserve"> (via an SMS service to be </w:t>
       </w:r>
       <w:r>
         <w:rPr>
+          <w:rFonts w:asciiTheme="majorHAnsi" w:hAnsiTheme="majorHAnsi" w:cstheme="majorHAnsi"/>
           <w:b/>
           <w:bCs/>
         </w:rPr>
         <w:t>replicated from another project</w:t>
       </w:r>
       <w:r>
+        <w:rPr>
+          <w:rFonts w:asciiTheme="majorHAnsi" w:hAnsiTheme="majorHAnsi" w:cstheme="majorHAnsi"/>
+        </w:rPr>
         <w:t xml:space="preserve"> — none exists here today) prompting them to visit a </w:t>
       </w:r>
       <w:proofErr w:type="spellStart"/>
       <w:r>
         <w:rPr>
+          <w:rFonts w:asciiTheme="majorHAnsi" w:hAnsiTheme="majorHAnsi" w:cstheme="majorHAnsi"/>
           <w:b/>
           <w:bCs/>
         </w:rPr>
@@ -6265,20 +6669,30 @@
       <w:proofErr w:type="spellEnd"/>
       <w:r>
         <w:rPr>
+          <w:rFonts w:asciiTheme="majorHAnsi" w:hAnsiTheme="majorHAnsi" w:cstheme="majorHAnsi"/>
           <w:b/>
           <w:bCs/>
         </w:rPr>
         <w:t>, expiring, password-protected</w:t>
       </w:r>
       <w:r>
+        <w:rPr>
+          <w:rFonts w:asciiTheme="majorHAnsi" w:hAnsiTheme="majorHAnsi" w:cstheme="majorHAnsi"/>
+        </w:rPr>
         <w:t xml:space="preserve"> download link for their </w:t>
       </w:r>
       <w:proofErr w:type="spellStart"/>
       <w:r>
+        <w:rPr>
+          <w:rFonts w:asciiTheme="majorHAnsi" w:hAnsiTheme="majorHAnsi" w:cstheme="majorHAnsi"/>
+        </w:rPr>
         <w:t>payslip</w:t>
       </w:r>
       <w:proofErr w:type="spellEnd"/>
       <w:r>
+        <w:rPr>
+          <w:rFonts w:asciiTheme="majorHAnsi" w:hAnsiTheme="majorHAnsi" w:cstheme="majorHAnsi"/>
+        </w:rPr>
         <w:t>. This introduces genuinely new infrastructure the platform does not have:</w:t>
       </w:r>
     </w:p>
@@ -6289,9 +6703,13 @@
           <w:ilvl w:val="1"/>
           <w:numId w:val="11"/>
         </w:numPr>
-      </w:pPr>
-      <w:r>
-        <w:rPr>
+        <w:rPr>
+          <w:rFonts w:asciiTheme="majorHAnsi" w:hAnsiTheme="majorHAnsi" w:cstheme="majorHAnsi"/>
+        </w:rPr>
+      </w:pPr>
+      <w:r>
+        <w:rPr>
+          <w:rFonts w:asciiTheme="majorHAnsi" w:hAnsiTheme="majorHAnsi" w:cstheme="majorHAnsi"/>
           <w:b/>
           <w:bCs/>
         </w:rPr>
@@ -6300,6 +6718,7 @@
       <w:proofErr w:type="spellStart"/>
       <w:r>
         <w:rPr>
+          <w:rFonts w:asciiTheme="majorHAnsi" w:hAnsiTheme="majorHAnsi" w:cstheme="majorHAnsi"/>
           <w:b/>
           <w:bCs/>
         </w:rPr>
@@ -6308,28 +6727,37 @@
       <w:proofErr w:type="spellEnd"/>
       <w:r>
         <w:rPr>
+          <w:rFonts w:asciiTheme="majorHAnsi" w:hAnsiTheme="majorHAnsi" w:cstheme="majorHAnsi"/>
           <w:b/>
           <w:bCs/>
         </w:rPr>
         <w:t xml:space="preserve"> storage / retrievable artifact</w:t>
       </w:r>
       <w:r>
+        <w:rPr>
+          <w:rFonts w:asciiTheme="majorHAnsi" w:hAnsiTheme="majorHAnsi" w:cstheme="majorHAnsi"/>
+        </w:rPr>
         <w:t xml:space="preserve"> — today PDFs are generated </w:t>
       </w:r>
       <w:r>
         <w:rPr>
+          <w:rFonts w:asciiTheme="majorHAnsi" w:hAnsiTheme="majorHAnsi" w:cstheme="majorHAnsi"/>
           <w:b/>
           <w:bCs/>
         </w:rPr>
         <w:t>in-memory only</w:t>
       </w:r>
       <w:r>
+        <w:rPr>
+          <w:rFonts w:asciiTheme="majorHAnsi" w:hAnsiTheme="majorHAnsi" w:cstheme="majorHAnsi"/>
+        </w:rPr>
         <w:t xml:space="preserve"> (</w:t>
       </w:r>
       <w:proofErr w:type="gramStart"/>
       <w:r>
         <w:rPr>
           <w:rStyle w:val="VerbatimChar"/>
+          <w:rFonts w:asciiTheme="majorHAnsi" w:hAnsiTheme="majorHAnsi" w:cstheme="majorHAnsi"/>
         </w:rPr>
         <w:t>byte[</w:t>
       </w:r>
@@ -6337,18 +6765,28 @@
       <w:r>
         <w:rPr>
           <w:rStyle w:val="VerbatimChar"/>
+          <w:rFonts w:asciiTheme="majorHAnsi" w:hAnsiTheme="majorHAnsi" w:cstheme="majorHAnsi"/>
         </w:rPr>
         <w:t>]</w:t>
       </w:r>
       <w:r>
+        <w:rPr>
+          <w:rFonts w:asciiTheme="majorHAnsi" w:hAnsiTheme="majorHAnsi" w:cstheme="majorHAnsi"/>
+        </w:rPr>
         <w:t>), never stored. A secure link needs the PDF (</w:t>
       </w:r>
       <w:proofErr w:type="gramStart"/>
       <w:r>
+        <w:rPr>
+          <w:rFonts w:asciiTheme="majorHAnsi" w:hAnsiTheme="majorHAnsi" w:cstheme="majorHAnsi"/>
+        </w:rPr>
         <w:t>or</w:t>
       </w:r>
       <w:proofErr w:type="gramEnd"/>
       <w:r>
+        <w:rPr>
+          <w:rFonts w:asciiTheme="majorHAnsi" w:hAnsiTheme="majorHAnsi" w:cstheme="majorHAnsi"/>
+        </w:rPr>
         <w:t xml:space="preserve"> a regenerate-on-demand token) to be retrievable after the run.</w:t>
       </w:r>
     </w:p>
@@ -6359,9 +6797,13 @@
           <w:ilvl w:val="1"/>
           <w:numId w:val="11"/>
         </w:numPr>
-      </w:pPr>
-      <w:r>
-        <w:rPr>
+        <w:rPr>
+          <w:rFonts w:asciiTheme="majorHAnsi" w:hAnsiTheme="majorHAnsi" w:cstheme="majorHAnsi"/>
+        </w:rPr>
+      </w:pPr>
+      <w:r>
+        <w:rPr>
+          <w:rFonts w:asciiTheme="majorHAnsi" w:hAnsiTheme="majorHAnsi" w:cstheme="majorHAnsi"/>
           <w:b/>
           <w:bCs/>
         </w:rPr>
@@ -6370,6 +6812,7 @@
       <w:proofErr w:type="spellStart"/>
       <w:r>
         <w:rPr>
+          <w:rFonts w:asciiTheme="majorHAnsi" w:hAnsiTheme="majorHAnsi" w:cstheme="majorHAnsi"/>
           <w:b/>
           <w:bCs/>
         </w:rPr>
@@ -6378,20 +6821,30 @@
       <w:proofErr w:type="spellEnd"/>
       <w:r>
         <w:rPr>
+          <w:rFonts w:asciiTheme="majorHAnsi" w:hAnsiTheme="majorHAnsi" w:cstheme="majorHAnsi"/>
           <w:b/>
           <w:bCs/>
         </w:rPr>
         <w:t xml:space="preserve"> download endpoint</w:t>
       </w:r>
       <w:r>
+        <w:rPr>
+          <w:rFonts w:asciiTheme="majorHAnsi" w:hAnsiTheme="majorHAnsi" w:cstheme="majorHAnsi"/>
+        </w:rPr>
         <w:t xml:space="preserve"> with expiration + password (GDPR: </w:t>
       </w:r>
       <w:proofErr w:type="spellStart"/>
       <w:r>
+        <w:rPr>
+          <w:rFonts w:asciiTheme="majorHAnsi" w:hAnsiTheme="majorHAnsi" w:cstheme="majorHAnsi"/>
+        </w:rPr>
         <w:t>minimise</w:t>
       </w:r>
       <w:proofErr w:type="spellEnd"/>
       <w:r>
+        <w:rPr>
+          <w:rFonts w:asciiTheme="majorHAnsi" w:hAnsiTheme="majorHAnsi" w:cstheme="majorHAnsi"/>
+        </w:rPr>
         <w:t xml:space="preserve"> exposure, short TTL, no PII in the URL, access-logged).</w:t>
       </w:r>
     </w:p>
@@ -6402,16 +6855,22 @@
           <w:ilvl w:val="1"/>
           <w:numId w:val="11"/>
         </w:numPr>
-      </w:pPr>
-      <w:r>
-        <w:rPr>
-          <w:b/>
-          <w:bCs/>
-        </w:rPr>
-        <w:lastRenderedPageBreak/>
+        <w:rPr>
+          <w:rFonts w:asciiTheme="majorHAnsi" w:hAnsiTheme="majorHAnsi" w:cstheme="majorHAnsi"/>
+        </w:rPr>
+      </w:pPr>
+      <w:r>
+        <w:rPr>
+          <w:rFonts w:asciiTheme="majorHAnsi" w:hAnsiTheme="majorHAnsi" w:cstheme="majorHAnsi"/>
+          <w:b/>
+          <w:bCs/>
+        </w:rPr>
         <w:t>An SMS sender</w:t>
       </w:r>
       <w:r>
+        <w:rPr>
+          <w:rFonts w:asciiTheme="majorHAnsi" w:hAnsiTheme="majorHAnsi" w:cstheme="majorHAnsi"/>
+        </w:rPr>
         <w:t xml:space="preserve"> integrated as a delivery channel (mirroring the email path; the outbox/spine may need a channel concept, or SMS gets its own small sender).</w:t>
       </w:r>
     </w:p>
@@ -6422,34 +6881,66 @@
           <w:ilvl w:val="1"/>
           <w:numId w:val="11"/>
         </w:numPr>
-      </w:pPr>
-      <w:r>
-        <w:rPr>
+        <w:rPr>
+          <w:rFonts w:asciiTheme="majorHAnsi" w:hAnsiTheme="majorHAnsi" w:cstheme="majorHAnsi"/>
+        </w:rPr>
+      </w:pPr>
+      <w:r>
+        <w:rPr>
+          <w:rFonts w:asciiTheme="majorHAnsi" w:hAnsiTheme="majorHAnsi" w:cstheme="majorHAnsi"/>
           <w:b/>
           <w:bCs/>
         </w:rPr>
         <w:t>Employee contact field</w:t>
       </w:r>
       <w:r>
+        <w:rPr>
+          <w:rFonts w:asciiTheme="majorHAnsi" w:hAnsiTheme="majorHAnsi" w:cstheme="majorHAnsi"/>
+        </w:rPr>
         <w:t xml:space="preserve"> — </w:t>
       </w:r>
       <w:proofErr w:type="spellStart"/>
       <w:r>
         <w:rPr>
           <w:rStyle w:val="VerbatimChar"/>
+          <w:rFonts w:asciiTheme="majorHAnsi" w:hAnsiTheme="majorHAnsi" w:cstheme="majorHAnsi"/>
         </w:rPr>
         <w:t>Employee.Phone</w:t>
       </w:r>
       <w:proofErr w:type="spellEnd"/>
       <w:r>
+        <w:rPr>
+          <w:rFonts w:asciiTheme="majorHAnsi" w:hAnsiTheme="majorHAnsi" w:cstheme="majorHAnsi"/>
+        </w:rPr>
         <w:t xml:space="preserve"> exists (single column; no separate Mobile), reusable for SMS.</w:t>
       </w:r>
     </w:p>
     <w:p>
       <w:pPr>
+        <w:rPr>
+          <w:rFonts w:asciiTheme="majorHAnsi" w:hAnsiTheme="majorHAnsi" w:cstheme="majorHAnsi"/>
+        </w:rPr>
+      </w:pPr>
+    </w:p>
+    <w:p>
+      <w:pPr>
+        <w:rPr>
+          <w:rFonts w:asciiTheme="majorHAnsi" w:hAnsiTheme="majorHAnsi" w:cstheme="majorHAnsi"/>
+        </w:rPr>
+      </w:pPr>
+    </w:p>
+    <w:p>
+      <w:pPr>
         <w:pStyle w:val="Heading4"/>
-      </w:pPr>
-      <w:r>
+        <w:rPr>
+          <w:rFonts w:cstheme="majorHAnsi"/>
+        </w:rPr>
+      </w:pPr>
+      <w:r>
+        <w:rPr>
+          <w:rFonts w:cstheme="majorHAnsi"/>
+        </w:rPr>
+        <w:lastRenderedPageBreak/>
         <w:t>What it reuses vs. what is new</w:t>
       </w:r>
     </w:p>
@@ -6460,8 +6951,8 @@
         <w:tblLook w:val="06A0" w:firstRow="1" w:lastRow="0" w:firstColumn="1" w:lastColumn="0" w:noHBand="1" w:noVBand="1"/>
       </w:tblPr>
       <w:tblGrid>
-        <w:gridCol w:w="3375"/>
-        <w:gridCol w:w="5641"/>
+        <w:gridCol w:w="3136"/>
+        <w:gridCol w:w="5880"/>
       </w:tblGrid>
       <w:tr>
         <w:trPr>
@@ -6473,7 +6964,15 @@
             <w:tcW w:w="0" w:type="auto"/>
           </w:tcPr>
           <w:p>
-            <w:r>
+            <w:pPr>
+              <w:rPr>
+                <w:rFonts w:asciiTheme="majorHAnsi" w:hAnsiTheme="majorHAnsi" w:cstheme="majorHAnsi"/>
+              </w:rPr>
+            </w:pPr>
+            <w:r>
+              <w:rPr>
+                <w:rFonts w:asciiTheme="majorHAnsi" w:hAnsiTheme="majorHAnsi" w:cstheme="majorHAnsi"/>
+              </w:rPr>
               <w:t>Reuses (already built)</w:t>
             </w:r>
           </w:p>
@@ -6485,8 +6984,14 @@
           <w:p>
             <w:pPr>
               <w:cnfStyle w:val="100000000000" w:firstRow="1" w:lastRow="0" w:firstColumn="0" w:lastColumn="0" w:oddVBand="0" w:evenVBand="0" w:oddHBand="0" w:evenHBand="0" w:firstRowFirstColumn="0" w:firstRowLastColumn="0" w:lastRowFirstColumn="0" w:lastRowLastColumn="0"/>
-            </w:pPr>
-            <w:r>
+              <w:rPr>
+                <w:rFonts w:asciiTheme="majorHAnsi" w:hAnsiTheme="majorHAnsi" w:cstheme="majorHAnsi"/>
+              </w:rPr>
+            </w:pPr>
+            <w:r>
+              <w:rPr>
+                <w:rFonts w:asciiTheme="majorHAnsi" w:hAnsiTheme="majorHAnsi" w:cstheme="majorHAnsi"/>
+              </w:rPr>
               <w:t>New (this assistant introduces)</w:t>
             </w:r>
           </w:p>
@@ -6499,19 +7004,31 @@
             <w:tcW w:w="0" w:type="auto"/>
           </w:tcPr>
           <w:p>
+            <w:pPr>
+              <w:rPr>
+                <w:rFonts w:asciiTheme="majorHAnsi" w:hAnsiTheme="majorHAnsi" w:cstheme="majorHAnsi"/>
+              </w:rPr>
+            </w:pPr>
             <w:proofErr w:type="spellStart"/>
             <w:r>
               <w:rPr>
                 <w:rStyle w:val="VerbatimChar"/>
+                <w:rFonts w:asciiTheme="majorHAnsi" w:hAnsiTheme="majorHAnsi" w:cstheme="majorHAnsi"/>
               </w:rPr>
               <w:t>IPayrollService</w:t>
             </w:r>
             <w:proofErr w:type="spellEnd"/>
             <w:r>
+              <w:rPr>
+                <w:rFonts w:asciiTheme="majorHAnsi" w:hAnsiTheme="majorHAnsi" w:cstheme="majorHAnsi"/>
+              </w:rPr>
               <w:t xml:space="preserve"> generation/</w:t>
             </w:r>
             <w:proofErr w:type="spellStart"/>
             <w:r>
+              <w:rPr>
+                <w:rFonts w:asciiTheme="majorHAnsi" w:hAnsiTheme="majorHAnsi" w:cstheme="majorHAnsi"/>
+              </w:rPr>
               <w:t>finalisation</w:t>
             </w:r>
             <w:proofErr w:type="spellEnd"/>
@@ -6524,29 +7041,43 @@
           <w:p>
             <w:pPr>
               <w:cnfStyle w:val="000000000000" w:firstRow="0" w:lastRow="0" w:firstColumn="0" w:lastColumn="0" w:oddVBand="0" w:evenVBand="0" w:oddHBand="0" w:evenHBand="0" w:firstRowFirstColumn="0" w:firstRowLastColumn="0" w:lastRowFirstColumn="0" w:lastRowLastColumn="0"/>
-            </w:pPr>
-            <w:r>
+              <w:rPr>
+                <w:rFonts w:asciiTheme="majorHAnsi" w:hAnsiTheme="majorHAnsi" w:cstheme="majorHAnsi"/>
+              </w:rPr>
+            </w:pPr>
+            <w:r>
+              <w:rPr>
+                <w:rFonts w:asciiTheme="majorHAnsi" w:hAnsiTheme="majorHAnsi" w:cstheme="majorHAnsi"/>
+              </w:rPr>
               <w:t xml:space="preserve">A monthly </w:t>
             </w:r>
             <w:r>
               <w:rPr>
+                <w:rFonts w:asciiTheme="majorHAnsi" w:hAnsiTheme="majorHAnsi" w:cstheme="majorHAnsi"/>
                 <w:b/>
                 <w:bCs/>
               </w:rPr>
               <w:t>scheduler</w:t>
             </w:r>
             <w:r>
+              <w:rPr>
+                <w:rFonts w:asciiTheme="majorHAnsi" w:hAnsiTheme="majorHAnsi" w:cstheme="majorHAnsi"/>
+              </w:rPr>
               <w:t xml:space="preserve"> (mirror </w:t>
             </w:r>
             <w:proofErr w:type="spellStart"/>
             <w:r>
               <w:rPr>
                 <w:rStyle w:val="VerbatimChar"/>
+                <w:rFonts w:asciiTheme="majorHAnsi" w:hAnsiTheme="majorHAnsi" w:cstheme="majorHAnsi"/>
               </w:rPr>
               <w:t>PaymentReminderBackgroundService</w:t>
             </w:r>
             <w:proofErr w:type="spellEnd"/>
             <w:r>
+              <w:rPr>
+                <w:rFonts w:asciiTheme="majorHAnsi" w:hAnsiTheme="majorHAnsi" w:cstheme="majorHAnsi"/>
+              </w:rPr>
               <w:t>)</w:t>
             </w:r>
           </w:p>
@@ -6559,15 +7090,24 @@
             <w:tcW w:w="0" w:type="auto"/>
           </w:tcPr>
           <w:p>
+            <w:pPr>
+              <w:rPr>
+                <w:rFonts w:asciiTheme="majorHAnsi" w:hAnsiTheme="majorHAnsi" w:cstheme="majorHAnsi"/>
+              </w:rPr>
+            </w:pPr>
             <w:proofErr w:type="spellStart"/>
             <w:r>
               <w:rPr>
                 <w:rStyle w:val="VerbatimChar"/>
+                <w:rFonts w:asciiTheme="majorHAnsi" w:hAnsiTheme="majorHAnsi" w:cstheme="majorHAnsi"/>
               </w:rPr>
               <w:t>IPayslipEmailService</w:t>
             </w:r>
             <w:proofErr w:type="spellEnd"/>
             <w:r>
+              <w:rPr>
+                <w:rFonts w:asciiTheme="majorHAnsi" w:hAnsiTheme="majorHAnsi" w:cstheme="majorHAnsi"/>
+              </w:rPr>
               <w:t xml:space="preserve"> (single + batch email)</w:t>
             </w:r>
           </w:p>
@@ -6579,26 +7119,42 @@
           <w:p>
             <w:pPr>
               <w:cnfStyle w:val="000000000000" w:firstRow="0" w:lastRow="0" w:firstColumn="0" w:lastColumn="0" w:oddVBand="0" w:evenVBand="0" w:oddHBand="0" w:evenHBand="0" w:firstRowFirstColumn="0" w:firstRowLastColumn="0" w:lastRowFirstColumn="0" w:lastRowLastColumn="0"/>
-            </w:pPr>
-            <w:r>
+              <w:rPr>
+                <w:rFonts w:asciiTheme="majorHAnsi" w:hAnsiTheme="majorHAnsi" w:cstheme="majorHAnsi"/>
+              </w:rPr>
+            </w:pPr>
+            <w:r>
+              <w:rPr>
+                <w:rFonts w:asciiTheme="majorHAnsi" w:hAnsiTheme="majorHAnsi" w:cstheme="majorHAnsi"/>
+              </w:rPr>
               <w:t xml:space="preserve">Per-business </w:t>
             </w:r>
             <w:r>
               <w:rPr>
+                <w:rFonts w:asciiTheme="majorHAnsi" w:hAnsiTheme="majorHAnsi" w:cstheme="majorHAnsi"/>
                 <w:b/>
                 <w:bCs/>
               </w:rPr>
               <w:t>assistant config</w:t>
             </w:r>
             <w:r>
+              <w:rPr>
+                <w:rFonts w:asciiTheme="majorHAnsi" w:hAnsiTheme="majorHAnsi" w:cstheme="majorHAnsi"/>
+              </w:rPr>
               <w:t xml:space="preserve"> (mode, day/time, channels, auto-</w:t>
             </w:r>
             <w:proofErr w:type="spellStart"/>
             <w:r>
+              <w:rPr>
+                <w:rFonts w:asciiTheme="majorHAnsi" w:hAnsiTheme="majorHAnsi" w:cstheme="majorHAnsi"/>
+              </w:rPr>
               <w:t>finalise</w:t>
             </w:r>
             <w:proofErr w:type="spellEnd"/>
             <w:r>
+              <w:rPr>
+                <w:rFonts w:asciiTheme="majorHAnsi" w:hAnsiTheme="majorHAnsi" w:cstheme="majorHAnsi"/>
+              </w:rPr>
               <w:t xml:space="preserve"> choice)</w:t>
             </w:r>
           </w:p>
@@ -6611,26 +7167,39 @@
             <w:tcW w:w="0" w:type="auto"/>
           </w:tcPr>
           <w:p>
+            <w:pPr>
+              <w:rPr>
+                <w:rFonts w:asciiTheme="majorHAnsi" w:hAnsiTheme="majorHAnsi" w:cstheme="majorHAnsi"/>
+              </w:rPr>
+            </w:pPr>
             <w:proofErr w:type="spellStart"/>
             <w:r>
               <w:rPr>
                 <w:rStyle w:val="VerbatimChar"/>
+                <w:rFonts w:asciiTheme="majorHAnsi" w:hAnsiTheme="majorHAnsi" w:cstheme="majorHAnsi"/>
               </w:rPr>
               <w:t>IPayslipRenderer</w:t>
             </w:r>
             <w:proofErr w:type="spellEnd"/>
             <w:r>
+              <w:rPr>
+                <w:rFonts w:asciiTheme="majorHAnsi" w:hAnsiTheme="majorHAnsi" w:cstheme="majorHAnsi"/>
+              </w:rPr>
               <w:t xml:space="preserve"> + </w:t>
             </w:r>
             <w:proofErr w:type="spellStart"/>
             <w:r>
               <w:rPr>
                 <w:rStyle w:val="VerbatimChar"/>
+                <w:rFonts w:asciiTheme="majorHAnsi" w:hAnsiTheme="majorHAnsi" w:cstheme="majorHAnsi"/>
               </w:rPr>
               <w:t>IPayslipPdfService</w:t>
             </w:r>
             <w:proofErr w:type="spellEnd"/>
             <w:r>
+              <w:rPr>
+                <w:rFonts w:asciiTheme="majorHAnsi" w:hAnsiTheme="majorHAnsi" w:cstheme="majorHAnsi"/>
+              </w:rPr>
               <w:t xml:space="preserve"> (PDF)</w:t>
             </w:r>
           </w:p>
@@ -6642,15 +7211,22 @@
           <w:p>
             <w:pPr>
               <w:cnfStyle w:val="000000000000" w:firstRow="0" w:lastRow="0" w:firstColumn="0" w:lastColumn="0" w:oddVBand="0" w:evenVBand="0" w:oddHBand="0" w:evenHBand="0" w:firstRowFirstColumn="0" w:firstRowLastColumn="0" w:lastRowFirstColumn="0" w:lastRowLastColumn="0"/>
-            </w:pPr>
-            <w:r>
-              <w:rPr>
+              <w:rPr>
+                <w:rFonts w:asciiTheme="majorHAnsi" w:hAnsiTheme="majorHAnsi" w:cstheme="majorHAnsi"/>
+              </w:rPr>
+            </w:pPr>
+            <w:r>
+              <w:rPr>
+                <w:rFonts w:asciiTheme="majorHAnsi" w:hAnsiTheme="majorHAnsi" w:cstheme="majorHAnsi"/>
                 <w:b/>
                 <w:bCs/>
               </w:rPr>
               <w:t>Idempotency guard</w:t>
             </w:r>
             <w:r>
+              <w:rPr>
+                <w:rFonts w:asciiTheme="majorHAnsi" w:hAnsiTheme="majorHAnsi" w:cstheme="majorHAnsi"/>
+              </w:rPr>
               <w:t xml:space="preserve"> per (business, Year, Month) so a monthly re-run never double-generates/sends</w:t>
             </w:r>
           </w:p>
@@ -6663,7 +7239,15 @@
             <w:tcW w:w="0" w:type="auto"/>
           </w:tcPr>
           <w:p>
-            <w:r>
+            <w:pPr>
+              <w:rPr>
+                <w:rFonts w:asciiTheme="majorHAnsi" w:hAnsiTheme="majorHAnsi" w:cstheme="majorHAnsi"/>
+              </w:rPr>
+            </w:pPr>
+            <w:r>
+              <w:rPr>
+                <w:rFonts w:asciiTheme="majorHAnsi" w:hAnsiTheme="majorHAnsi" w:cstheme="majorHAnsi"/>
+              </w:rPr>
               <w:t>Notification spine (owner alerts)</w:t>
             </w:r>
           </w:p>
@@ -6675,19 +7259,27 @@
           <w:p>
             <w:pPr>
               <w:cnfStyle w:val="000000000000" w:firstRow="0" w:lastRow="0" w:firstColumn="0" w:lastColumn="0" w:oddVBand="0" w:evenVBand="0" w:oddHBand="0" w:evenHBand="0" w:firstRowFirstColumn="0" w:firstRowLastColumn="0" w:lastRowFirstColumn="0" w:lastRowLastColumn="0"/>
-            </w:pPr>
-            <w:r>
-              <w:rPr>
+              <w:rPr>
+                <w:rFonts w:asciiTheme="majorHAnsi" w:hAnsiTheme="majorHAnsi" w:cstheme="majorHAnsi"/>
+              </w:rPr>
+            </w:pPr>
+            <w:r>
+              <w:rPr>
+                <w:rFonts w:asciiTheme="majorHAnsi" w:hAnsiTheme="majorHAnsi" w:cstheme="majorHAnsi"/>
                 <w:b/>
                 <w:bCs/>
               </w:rPr>
               <w:t>SMS channel</w:t>
             </w:r>
             <w:r>
+              <w:rPr>
+                <w:rFonts w:asciiTheme="majorHAnsi" w:hAnsiTheme="majorHAnsi" w:cstheme="majorHAnsi"/>
+              </w:rPr>
               <w:t xml:space="preserve"> + </w:t>
             </w:r>
             <w:r>
               <w:rPr>
+                <w:rFonts w:asciiTheme="majorHAnsi" w:hAnsiTheme="majorHAnsi" w:cstheme="majorHAnsi"/>
                 <w:b/>
                 <w:bCs/>
               </w:rPr>
@@ -6696,6 +7288,7 @@
             <w:proofErr w:type="spellStart"/>
             <w:r>
               <w:rPr>
+                <w:rFonts w:asciiTheme="majorHAnsi" w:hAnsiTheme="majorHAnsi" w:cstheme="majorHAnsi"/>
                 <w:b/>
                 <w:bCs/>
               </w:rPr>
@@ -6704,28 +7297,44 @@
             <w:proofErr w:type="spellEnd"/>
             <w:r>
               <w:rPr>
+                <w:rFonts w:asciiTheme="majorHAnsi" w:hAnsiTheme="majorHAnsi" w:cstheme="majorHAnsi"/>
                 <w:b/>
                 <w:bCs/>
               </w:rPr>
               <w:t xml:space="preserve"> link</w:t>
             </w:r>
             <w:r>
+              <w:rPr>
+                <w:rFonts w:asciiTheme="majorHAnsi" w:hAnsiTheme="majorHAnsi" w:cstheme="majorHAnsi"/>
+              </w:rPr>
               <w:t xml:space="preserve"> (storage + </w:t>
             </w:r>
             <w:proofErr w:type="spellStart"/>
             <w:r>
+              <w:rPr>
+                <w:rFonts w:asciiTheme="majorHAnsi" w:hAnsiTheme="majorHAnsi" w:cstheme="majorHAnsi"/>
+              </w:rPr>
               <w:t>tokenised</w:t>
             </w:r>
             <w:proofErr w:type="spellEnd"/>
             <w:r>
+              <w:rPr>
+                <w:rFonts w:asciiTheme="majorHAnsi" w:hAnsiTheme="majorHAnsi" w:cstheme="majorHAnsi"/>
+              </w:rPr>
               <w:t xml:space="preserve"> </w:t>
             </w:r>
             <w:proofErr w:type="gramStart"/>
             <w:r>
+              <w:rPr>
+                <w:rFonts w:asciiTheme="majorHAnsi" w:hAnsiTheme="majorHAnsi" w:cstheme="majorHAnsi"/>
+              </w:rPr>
               <w:t>endpoint) —</w:t>
             </w:r>
             <w:proofErr w:type="gramEnd"/>
             <w:r>
+              <w:rPr>
+                <w:rFonts w:asciiTheme="majorHAnsi" w:hAnsiTheme="majorHAnsi" w:cstheme="majorHAnsi"/>
+              </w:rPr>
               <w:t xml:space="preserve"> optional, heaviest</w:t>
             </w:r>
           </w:p>
@@ -6738,15 +7347,24 @@
             <w:tcW w:w="0" w:type="auto"/>
           </w:tcPr>
           <w:p>
+            <w:pPr>
+              <w:rPr>
+                <w:rFonts w:asciiTheme="majorHAnsi" w:hAnsiTheme="majorHAnsi" w:cstheme="majorHAnsi"/>
+              </w:rPr>
+            </w:pPr>
             <w:proofErr w:type="spellStart"/>
             <w:r>
               <w:rPr>
                 <w:rStyle w:val="VerbatimChar"/>
+                <w:rFonts w:asciiTheme="majorHAnsi" w:hAnsiTheme="majorHAnsi" w:cstheme="majorHAnsi"/>
               </w:rPr>
               <w:t>PayslipStatusType</w:t>
             </w:r>
             <w:proofErr w:type="spellEnd"/>
             <w:r>
+              <w:rPr>
+                <w:rFonts w:asciiTheme="majorHAnsi" w:hAnsiTheme="majorHAnsi" w:cstheme="majorHAnsi"/>
+              </w:rPr>
               <w:t xml:space="preserve"> lifecycle + guards</w:t>
             </w:r>
           </w:p>
@@ -6758,8 +7376,14 @@
           <w:p>
             <w:pPr>
               <w:cnfStyle w:val="000000000000" w:firstRow="0" w:lastRow="0" w:firstColumn="0" w:lastColumn="0" w:oddVBand="0" w:evenVBand="0" w:oddHBand="0" w:evenHBand="0" w:firstRowFirstColumn="0" w:firstRowLastColumn="0" w:lastRowFirstColumn="0" w:lastRowLastColumn="0"/>
-            </w:pPr>
-            <w:r>
+              <w:rPr>
+                <w:rFonts w:asciiTheme="majorHAnsi" w:hAnsiTheme="majorHAnsi" w:cstheme="majorHAnsi"/>
+              </w:rPr>
+            </w:pPr>
+            <w:r>
+              <w:rPr>
+                <w:rFonts w:asciiTheme="majorHAnsi" w:hAnsiTheme="majorHAnsi" w:cstheme="majorHAnsi"/>
+              </w:rPr>
               <w:t>Owner status notifications ("generated / awaiting review / still pending")</w:t>
             </w:r>
           </w:p>
@@ -6772,21 +7396,31 @@
             <w:tcW w:w="0" w:type="auto"/>
           </w:tcPr>
           <w:p>
+            <w:pPr>
+              <w:rPr>
+                <w:rFonts w:asciiTheme="majorHAnsi" w:hAnsiTheme="majorHAnsi" w:cstheme="majorHAnsi"/>
+              </w:rPr>
+            </w:pPr>
             <w:proofErr w:type="spellStart"/>
             <w:r>
               <w:rPr>
                 <w:rStyle w:val="VerbatimChar"/>
+                <w:rFonts w:asciiTheme="majorHAnsi" w:hAnsiTheme="majorHAnsi" w:cstheme="majorHAnsi"/>
               </w:rPr>
               <w:t>Employee.Email</w:t>
             </w:r>
             <w:proofErr w:type="spellEnd"/>
             <w:r>
+              <w:rPr>
+                <w:rFonts w:asciiTheme="majorHAnsi" w:hAnsiTheme="majorHAnsi" w:cstheme="majorHAnsi"/>
+              </w:rPr>
               <w:t xml:space="preserve"> / </w:t>
             </w:r>
             <w:proofErr w:type="spellStart"/>
             <w:r>
               <w:rPr>
                 <w:rStyle w:val="VerbatimChar"/>
+                <w:rFonts w:asciiTheme="majorHAnsi" w:hAnsiTheme="majorHAnsi" w:cstheme="majorHAnsi"/>
               </w:rPr>
               <w:t>Employee.Phone</w:t>
             </w:r>
@@ -6800,27 +7434,43 @@
           <w:p>
             <w:pPr>
               <w:cnfStyle w:val="000000000000" w:firstRow="0" w:lastRow="0" w:firstColumn="0" w:lastColumn="0" w:oddVBand="0" w:evenVBand="0" w:oddHBand="0" w:evenHBand="0" w:firstRowFirstColumn="0" w:firstRowLastColumn="0" w:lastRowFirstColumn="0" w:lastRowLastColumn="0"/>
-            </w:pPr>
-            <w:r>
+              <w:rPr>
+                <w:rFonts w:asciiTheme="majorHAnsi" w:hAnsiTheme="majorHAnsi" w:cstheme="majorHAnsi"/>
+              </w:rPr>
+            </w:pPr>
+            <w:r>
+              <w:rPr>
+                <w:rFonts w:asciiTheme="majorHAnsi" w:hAnsiTheme="majorHAnsi" w:cstheme="majorHAnsi"/>
+              </w:rPr>
               <w:t xml:space="preserve">A </w:t>
             </w:r>
             <w:proofErr w:type="spellStart"/>
             <w:r>
               <w:rPr>
                 <w:rStyle w:val="VerbatimChar"/>
+                <w:rFonts w:asciiTheme="majorHAnsi" w:hAnsiTheme="majorHAnsi" w:cstheme="majorHAnsi"/>
               </w:rPr>
               <w:t>payroll_assistant</w:t>
             </w:r>
             <w:proofErr w:type="spellEnd"/>
             <w:r>
+              <w:rPr>
+                <w:rFonts w:asciiTheme="majorHAnsi" w:hAnsiTheme="majorHAnsi" w:cstheme="majorHAnsi"/>
+              </w:rPr>
               <w:t xml:space="preserve"> </w:t>
             </w:r>
             <w:proofErr w:type="spellStart"/>
             <w:r>
+              <w:rPr>
+                <w:rFonts w:asciiTheme="majorHAnsi" w:hAnsiTheme="majorHAnsi" w:cstheme="majorHAnsi"/>
+              </w:rPr>
               <w:t>AssistantType</w:t>
             </w:r>
             <w:proofErr w:type="spellEnd"/>
             <w:r>
+              <w:rPr>
+                <w:rFonts w:asciiTheme="majorHAnsi" w:hAnsiTheme="majorHAnsi" w:cstheme="majorHAnsi"/>
+              </w:rPr>
               <w:t xml:space="preserve"> seed + Digital Assistants card</w:t>
             </w:r>
           </w:p>
@@ -6830,33 +7480,55 @@
     <w:p>
       <w:pPr>
         <w:pStyle w:val="Heading4"/>
-      </w:pPr>
-      <w:r>
+        <w:rPr>
+          <w:rFonts w:cstheme="majorHAnsi"/>
+        </w:rPr>
+      </w:pPr>
+      <w:r>
+        <w:rPr>
+          <w:rFonts w:cstheme="majorHAnsi"/>
+        </w:rPr>
         <w:t>Positioning</w:t>
       </w:r>
     </w:p>
     <w:p>
-      <w:r>
+      <w:pPr>
+        <w:rPr>
+          <w:rFonts w:asciiTheme="majorHAnsi" w:hAnsiTheme="majorHAnsi" w:cstheme="majorHAnsi"/>
+        </w:rPr>
+      </w:pPr>
+      <w:r>
+        <w:rPr>
+          <w:rFonts w:asciiTheme="majorHAnsi" w:hAnsiTheme="majorHAnsi" w:cstheme="majorHAnsi"/>
+        </w:rPr>
         <w:t xml:space="preserve">Like Recurring Invoices (Group 6), this is a scheduled document-generation assistant, so it belongs with the heavy, independent group. Its </w:t>
       </w:r>
       <w:r>
         <w:rPr>
+          <w:rFonts w:asciiTheme="majorHAnsi" w:hAnsiTheme="majorHAnsi" w:cstheme="majorHAnsi"/>
           <w:b/>
           <w:bCs/>
         </w:rPr>
         <w:t>email-only</w:t>
       </w:r>
       <w:r>
+        <w:rPr>
+          <w:rFonts w:asciiTheme="majorHAnsi" w:hAnsiTheme="majorHAnsi" w:cstheme="majorHAnsi"/>
+        </w:rPr>
         <w:t xml:space="preserve"> modes are near-term feasible because the payroll email path already exists; the </w:t>
       </w:r>
       <w:r>
         <w:rPr>
+          <w:rFonts w:asciiTheme="majorHAnsi" w:hAnsiTheme="majorHAnsi" w:cstheme="majorHAnsi"/>
           <w:b/>
           <w:bCs/>
         </w:rPr>
         <w:t>SMS + secure-link</w:t>
       </w:r>
       <w:r>
+        <w:rPr>
+          <w:rFonts w:asciiTheme="majorHAnsi" w:hAnsiTheme="majorHAnsi" w:cstheme="majorHAnsi"/>
+        </w:rPr>
         <w:t xml:space="preserve"> channel is a separate, heavier sub-effort with real GDPR surface area and should be phased on its own.</w:t>
       </w:r>
     </w:p>
@@ -6865,6 +7537,9 @@
         <w:pBdr>
           <w:bottom w:val="single" w:sz="6" w:space="0" w:color="000000"/>
         </w:pBdr>
+        <w:rPr>
+          <w:rFonts w:asciiTheme="majorHAnsi" w:hAnsiTheme="majorHAnsi" w:cstheme="majorHAnsi"/>
+        </w:rPr>
       </w:pPr>
     </w:p>
     <w:p>
@@ -6883,8 +7558,14 @@
     <w:p>
       <w:pPr>
         <w:pStyle w:val="Heading2"/>
-      </w:pPr>
-      <w:r>
+        <w:rPr>
+          <w:rFonts w:cstheme="majorHAnsi"/>
+        </w:rPr>
+      </w:pPr>
+      <w:r>
+        <w:rPr>
+          <w:rFonts w:cstheme="majorHAnsi"/>
+        </w:rPr>
         <w:lastRenderedPageBreak/>
         <w:t>4. Suggested delivery sequence</w:t>
       </w:r>
@@ -6892,15 +7573,22 @@
     <w:p>
       <w:pPr>
         <w:pStyle w:val="Quote"/>
-      </w:pPr>
-      <w:r>
-        <w:rPr>
+        <w:rPr>
+          <w:rFonts w:asciiTheme="majorHAnsi" w:hAnsiTheme="majorHAnsi" w:cstheme="majorHAnsi"/>
+        </w:rPr>
+      </w:pPr>
+      <w:r>
+        <w:rPr>
+          <w:rFonts w:asciiTheme="majorHAnsi" w:hAnsiTheme="majorHAnsi" w:cstheme="majorHAnsi"/>
           <w:b/>
           <w:bCs/>
         </w:rPr>
         <w:t>Correction:</w:t>
       </w:r>
       <w:r>
+        <w:rPr>
+          <w:rFonts w:asciiTheme="majorHAnsi" w:hAnsiTheme="majorHAnsi" w:cstheme="majorHAnsi"/>
+        </w:rPr>
         <w:t xml:space="preserve"> an earlier version of this sequence put Quotation Follow-Up first as a "spine-only quick win." That was wrong — Quotation Follow-Up is Category B and depends on the scheduled-scan engine (see the Group 2 category-correction note). The engine is therefore built first, in Group 3.</w:t>
       </w:r>
     </w:p>
@@ -6911,25 +7599,36 @@
           <w:ilvl w:val="0"/>
           <w:numId w:val="12"/>
         </w:numPr>
-      </w:pPr>
-      <w:r>
-        <w:rPr>
+        <w:rPr>
+          <w:rFonts w:asciiTheme="majorHAnsi" w:hAnsiTheme="majorHAnsi" w:cstheme="majorHAnsi"/>
+        </w:rPr>
+      </w:pPr>
+      <w:r>
+        <w:rPr>
+          <w:rFonts w:asciiTheme="majorHAnsi" w:hAnsiTheme="majorHAnsi" w:cstheme="majorHAnsi"/>
           <w:b/>
           <w:bCs/>
         </w:rPr>
         <w:t>Group 3 — Scheduled-scan engine + the two Weekly digests</w:t>
       </w:r>
       <w:r>
+        <w:rPr>
+          <w:rFonts w:asciiTheme="majorHAnsi" w:hAnsiTheme="majorHAnsi" w:cstheme="majorHAnsi"/>
+        </w:rPr>
         <w:t xml:space="preserve"> — builds the reusable Category B engine and ships two high-value owner digests on top of it. </w:t>
       </w:r>
       <w:r>
         <w:rPr>
+          <w:rFonts w:asciiTheme="majorHAnsi" w:hAnsiTheme="majorHAnsi" w:cstheme="majorHAnsi"/>
           <w:b/>
           <w:bCs/>
         </w:rPr>
         <w:t>Do this first</w:t>
       </w:r>
       <w:r>
+        <w:rPr>
+          <w:rFonts w:asciiTheme="majorHAnsi" w:hAnsiTheme="majorHAnsi" w:cstheme="majorHAnsi"/>
+        </w:rPr>
         <w:t xml:space="preserve"> — it is the foundation the other scheduled assistants (including Quotation Follow-Up) depend on.</w:t>
       </w:r>
     </w:p>
@@ -6940,15 +7639,22 @@
           <w:ilvl w:val="0"/>
           <w:numId w:val="12"/>
         </w:numPr>
-      </w:pPr>
-      <w:r>
-        <w:rPr>
+        <w:rPr>
+          <w:rFonts w:asciiTheme="majorHAnsi" w:hAnsiTheme="majorHAnsi" w:cstheme="majorHAnsi"/>
+        </w:rPr>
+      </w:pPr>
+      <w:r>
+        <w:rPr>
+          <w:rFonts w:asciiTheme="majorHAnsi" w:hAnsiTheme="majorHAnsi" w:cstheme="majorHAnsi"/>
           <w:b/>
           <w:bCs/>
         </w:rPr>
         <w:t>Group 2 — Quotation Follow-Up</w:t>
       </w:r>
       <w:r>
+        <w:rPr>
+          <w:rFonts w:asciiTheme="majorHAnsi" w:hAnsiTheme="majorHAnsi" w:cstheme="majorHAnsi"/>
+        </w:rPr>
         <w:t xml:space="preserve"> — now a straightforward consumer of the Group 3 engine (a scan query + an email template + the follow-up-tracking decision). The event-driven items in Group 2 (Sent acknowledgement, Accepted owner alert) are independent spine-only quick wins that can slot in any time.</w:t>
       </w:r>
     </w:p>
@@ -6959,15 +7665,22 @@
           <w:ilvl w:val="0"/>
           <w:numId w:val="12"/>
         </w:numPr>
-      </w:pPr>
-      <w:r>
-        <w:rPr>
+        <w:rPr>
+          <w:rFonts w:asciiTheme="majorHAnsi" w:hAnsiTheme="majorHAnsi" w:cstheme="majorHAnsi"/>
+        </w:rPr>
+      </w:pPr>
+      <w:r>
+        <w:rPr>
+          <w:rFonts w:asciiTheme="majorHAnsi" w:hAnsiTheme="majorHAnsi" w:cstheme="majorHAnsi"/>
           <w:b/>
           <w:bCs/>
         </w:rPr>
         <w:t>Group 4 / Group 5</w:t>
       </w:r>
       <w:r>
+        <w:rPr>
+          <w:rFonts w:asciiTheme="majorHAnsi" w:hAnsiTheme="majorHAnsi" w:cstheme="majorHAnsi"/>
+        </w:rPr>
         <w:t xml:space="preserve"> — layer additional scheduled and event assistants onto the now-proven engine (daily brief, VAT/compliance reminders, payment reminder migration, invoice-issued).</w:t>
       </w:r>
     </w:p>
@@ -6978,15 +7691,22 @@
           <w:ilvl w:val="0"/>
           <w:numId w:val="12"/>
         </w:numPr>
-      </w:pPr>
-      <w:r>
-        <w:rPr>
+        <w:rPr>
+          <w:rFonts w:asciiTheme="majorHAnsi" w:hAnsiTheme="majorHAnsi" w:cstheme="majorHAnsi"/>
+        </w:rPr>
+      </w:pPr>
+      <w:r>
+        <w:rPr>
+          <w:rFonts w:asciiTheme="majorHAnsi" w:hAnsiTheme="majorHAnsi" w:cstheme="majorHAnsi"/>
           <w:b/>
           <w:bCs/>
         </w:rPr>
         <w:t>Group 6 — Recurring Invoices</w:t>
       </w:r>
       <w:r>
+        <w:rPr>
+          <w:rFonts w:asciiTheme="majorHAnsi" w:hAnsiTheme="majorHAnsi" w:cstheme="majorHAnsi"/>
+        </w:rPr>
         <w:t xml:space="preserve"> — adds document generation on top of the scheduled engine.</w:t>
       </w:r>
     </w:p>
@@ -6997,24 +7717,40 @@
           <w:ilvl w:val="0"/>
           <w:numId w:val="12"/>
         </w:numPr>
-      </w:pPr>
-      <w:r>
-        <w:rPr>
+        <w:rPr>
+          <w:rFonts w:asciiTheme="majorHAnsi" w:hAnsiTheme="majorHAnsi" w:cstheme="majorHAnsi"/>
+        </w:rPr>
+      </w:pPr>
+      <w:r>
+        <w:rPr>
+          <w:rFonts w:asciiTheme="majorHAnsi" w:hAnsiTheme="majorHAnsi" w:cstheme="majorHAnsi"/>
           <w:b/>
           <w:bCs/>
         </w:rPr>
         <w:t>Group 7 — Payroll Assistant</w:t>
       </w:r>
       <w:r>
+        <w:rPr>
+          <w:rFonts w:asciiTheme="majorHAnsi" w:hAnsiTheme="majorHAnsi" w:cstheme="majorHAnsi"/>
+        </w:rPr>
         <w:t xml:space="preserve"> — independent scheduled document-generation assistant; email-only modes near-term, SMS + secure-link phased separately. Enterprise-gated.</w:t>
       </w:r>
     </w:p>
     <w:p>
-      <w:r>
+      <w:pPr>
+        <w:rPr>
+          <w:rFonts w:asciiTheme="majorHAnsi" w:hAnsiTheme="majorHAnsi" w:cstheme="majorHAnsi"/>
+        </w:rPr>
+      </w:pPr>
+      <w:r>
+        <w:rPr>
+          <w:rFonts w:asciiTheme="majorHAnsi" w:hAnsiTheme="majorHAnsi" w:cstheme="majorHAnsi"/>
+        </w:rPr>
         <w:t xml:space="preserve">The single most important architectural decision this document captures: </w:t>
       </w:r>
       <w:r>
         <w:rPr>
+          <w:rFonts w:asciiTheme="majorHAnsi" w:hAnsiTheme="majorHAnsi" w:cstheme="majorHAnsi"/>
           <w:b/>
           <w:bCs/>
         </w:rPr>
@@ -7023,6 +7759,7 @@
       <w:proofErr w:type="gramStart"/>
       <w:r>
         <w:rPr>
+          <w:rFonts w:asciiTheme="majorHAnsi" w:hAnsiTheme="majorHAnsi" w:cstheme="majorHAnsi"/>
           <w:b/>
           <w:bCs/>
         </w:rPr>
@@ -7031,12 +7768,16 @@
       <w:proofErr w:type="gramEnd"/>
       <w:r>
         <w:rPr>
+          <w:rFonts w:asciiTheme="majorHAnsi" w:hAnsiTheme="majorHAnsi" w:cstheme="majorHAnsi"/>
           <w:b/>
           <w:bCs/>
         </w:rPr>
         <w:t xml:space="preserve"> / digest engine (Category B infrastructure) should be built once, early (Group 3),</w:t>
       </w:r>
       <w:r>
+        <w:rPr>
+          <w:rFonts w:asciiTheme="majorHAnsi" w:hAnsiTheme="majorHAnsi" w:cstheme="majorHAnsi"/>
+        </w:rPr>
         <w:t xml:space="preserve"> because the two Weekly digests, the Recurring Invoices assistant, the payment reminder migration, and the VAT/compliance reminders all ride on it.</w:t>
       </w:r>
     </w:p>
@@ -7045,18 +7786,35 @@
         <w:pBdr>
           <w:bottom w:val="single" w:sz="6" w:space="0" w:color="000000"/>
         </w:pBdr>
-      </w:pPr>
-    </w:p>
-    <w:p>
-      <w:r>
+        <w:rPr>
+          <w:rFonts w:asciiTheme="majorHAnsi" w:hAnsiTheme="majorHAnsi" w:cstheme="majorHAnsi"/>
+        </w:rPr>
+      </w:pPr>
+    </w:p>
+    <w:p>
+      <w:pPr>
+        <w:rPr>
+          <w:rFonts w:asciiTheme="majorHAnsi" w:hAnsiTheme="majorHAnsi" w:cstheme="majorHAnsi"/>
+        </w:rPr>
+      </w:pPr>
+      <w:r>
+        <w:rPr>
+          <w:rFonts w:asciiTheme="majorHAnsi" w:hAnsiTheme="majorHAnsi" w:cstheme="majorHAnsi"/>
+        </w:rPr>
         <w:br w:type="page"/>
       </w:r>
     </w:p>
     <w:p>
       <w:pPr>
         <w:pStyle w:val="Heading2"/>
-      </w:pPr>
-      <w:r>
+        <w:rPr>
+          <w:rFonts w:cstheme="majorHAnsi"/>
+        </w:rPr>
+      </w:pPr>
+      <w:r>
+        <w:rPr>
+          <w:rFonts w:cstheme="majorHAnsi"/>
+        </w:rPr>
         <w:lastRenderedPageBreak/>
         <w:t>5. Where this fits with existing docs</w:t>
       </w:r>
@@ -7068,9 +7826,13 @@
           <w:ilvl w:val="0"/>
           <w:numId w:val="13"/>
         </w:numPr>
-      </w:pPr>
-      <w:r>
-        <w:rPr>
+        <w:rPr>
+          <w:rFonts w:asciiTheme="majorHAnsi" w:hAnsiTheme="majorHAnsi" w:cstheme="majorHAnsi"/>
+        </w:rPr>
+      </w:pPr>
+      <w:r>
+        <w:rPr>
+          <w:rFonts w:asciiTheme="majorHAnsi" w:hAnsiTheme="majorHAnsi" w:cstheme="majorHAnsi"/>
           <w:b/>
           <w:bCs/>
         </w:rPr>
@@ -7079,17 +7841,22 @@
       <w:proofErr w:type="gramStart"/>
       <w:r>
         <w:rPr>
+          <w:rFonts w:asciiTheme="majorHAnsi" w:hAnsiTheme="majorHAnsi" w:cstheme="majorHAnsi"/>
           <w:b/>
           <w:bCs/>
         </w:rPr>
         <w:t>:</w:t>
       </w:r>
       <w:r>
+        <w:rPr>
+          <w:rFonts w:asciiTheme="majorHAnsi" w:hAnsiTheme="majorHAnsi" w:cstheme="majorHAnsi"/>
+        </w:rPr>
         <w:t xml:space="preserve"> </w:t>
       </w:r>
       <w:r>
         <w:rPr>
           <w:rStyle w:val="VerbatimChar"/>
+          <w:rFonts w:asciiTheme="majorHAnsi" w:hAnsiTheme="majorHAnsi" w:cstheme="majorHAnsi"/>
         </w:rPr>
         <w:t>.</w:t>
       </w:r>
@@ -7097,6 +7864,7 @@
       <w:r>
         <w:rPr>
           <w:rStyle w:val="VerbatimChar"/>
+          <w:rFonts w:asciiTheme="majorHAnsi" w:hAnsiTheme="majorHAnsi" w:cstheme="majorHAnsi"/>
         </w:rPr>
         <w:t>kiro</w:t>
       </w:r>
@@ -7105,37 +7873,53 @@
       <w:r>
         <w:rPr>
           <w:rStyle w:val="VerbatimChar"/>
+          <w:rFonts w:asciiTheme="majorHAnsi" w:hAnsiTheme="majorHAnsi" w:cstheme="majorHAnsi"/>
         </w:rPr>
         <w:t>/specs/digital-assistants-notifications/</w:t>
       </w:r>
       <w:r>
+        <w:rPr>
+          <w:rFonts w:asciiTheme="majorHAnsi" w:hAnsiTheme="majorHAnsi" w:cstheme="majorHAnsi"/>
+        </w:rPr>
         <w:t xml:space="preserve"> (</w:t>
       </w:r>
       <w:r>
         <w:rPr>
           <w:rStyle w:val="VerbatimChar"/>
+          <w:rFonts w:asciiTheme="majorHAnsi" w:hAnsiTheme="majorHAnsi" w:cstheme="majorHAnsi"/>
         </w:rPr>
         <w:t>requirements.md</w:t>
       </w:r>
       <w:r>
+        <w:rPr>
+          <w:rFonts w:asciiTheme="majorHAnsi" w:hAnsiTheme="majorHAnsi" w:cstheme="majorHAnsi"/>
+        </w:rPr>
         <w:t xml:space="preserve">, </w:t>
       </w:r>
       <w:r>
         <w:rPr>
           <w:rStyle w:val="VerbatimChar"/>
+          <w:rFonts w:asciiTheme="majorHAnsi" w:hAnsiTheme="majorHAnsi" w:cstheme="majorHAnsi"/>
         </w:rPr>
         <w:t>design.md</w:t>
       </w:r>
       <w:r>
+        <w:rPr>
+          <w:rFonts w:asciiTheme="majorHAnsi" w:hAnsiTheme="majorHAnsi" w:cstheme="majorHAnsi"/>
+        </w:rPr>
         <w:t xml:space="preserve">, </w:t>
       </w:r>
       <w:r>
         <w:rPr>
           <w:rStyle w:val="VerbatimChar"/>
+          <w:rFonts w:asciiTheme="majorHAnsi" w:hAnsiTheme="majorHAnsi" w:cstheme="majorHAnsi"/>
         </w:rPr>
         <w:t>tasks.md</w:t>
       </w:r>
       <w:r>
+        <w:rPr>
+          <w:rFonts w:asciiTheme="majorHAnsi" w:hAnsiTheme="majorHAnsi" w:cstheme="majorHAnsi"/>
+        </w:rPr>
         <w:t>).</w:t>
       </w:r>
     </w:p>
@@ -7146,24 +7930,35 @@
           <w:ilvl w:val="0"/>
           <w:numId w:val="13"/>
         </w:numPr>
-      </w:pPr>
-      <w:r>
-        <w:rPr>
+        <w:rPr>
+          <w:rFonts w:asciiTheme="majorHAnsi" w:hAnsiTheme="majorHAnsi" w:cstheme="majorHAnsi"/>
+        </w:rPr>
+      </w:pPr>
+      <w:r>
+        <w:rPr>
+          <w:rFonts w:asciiTheme="majorHAnsi" w:hAnsiTheme="majorHAnsi" w:cstheme="majorHAnsi"/>
           <w:b/>
           <w:bCs/>
         </w:rPr>
         <w:t>Recurring Invoices (Group 6) design:</w:t>
       </w:r>
       <w:r>
+        <w:rPr>
+          <w:rFonts w:asciiTheme="majorHAnsi" w:hAnsiTheme="majorHAnsi" w:cstheme="majorHAnsi"/>
+        </w:rPr>
         <w:t xml:space="preserve"> </w:t>
       </w:r>
       <w:r>
         <w:rPr>
           <w:rStyle w:val="VerbatimChar"/>
+          <w:rFonts w:asciiTheme="majorHAnsi" w:hAnsiTheme="majorHAnsi" w:cstheme="majorHAnsi"/>
         </w:rPr>
         <w:t>design.md</w:t>
       </w:r>
       <w:r>
+        <w:rPr>
+          <w:rFonts w:asciiTheme="majorHAnsi" w:hAnsiTheme="majorHAnsi" w:cstheme="majorHAnsi"/>
+        </w:rPr>
         <w:t xml:space="preserve"> → "Phase 2 — Recurring Invoices Assistant".</w:t>
       </w:r>
     </w:p>
@@ -7174,9 +7969,13 @@
           <w:ilvl w:val="0"/>
           <w:numId w:val="13"/>
         </w:numPr>
-      </w:pPr>
-      <w:r>
-        <w:rPr>
+        <w:rPr>
+          <w:rFonts w:asciiTheme="majorHAnsi" w:hAnsiTheme="majorHAnsi" w:cstheme="majorHAnsi"/>
+        </w:rPr>
+      </w:pPr>
+      <w:r>
+        <w:rPr>
+          <w:rFonts w:asciiTheme="majorHAnsi" w:hAnsiTheme="majorHAnsi" w:cstheme="majorHAnsi"/>
           <w:b/>
           <w:bCs/>
         </w:rPr>
@@ -7185,17 +7984,22 @@
       <w:proofErr w:type="gramStart"/>
       <w:r>
         <w:rPr>
+          <w:rFonts w:asciiTheme="majorHAnsi" w:hAnsiTheme="majorHAnsi" w:cstheme="majorHAnsi"/>
           <w:b/>
           <w:bCs/>
         </w:rPr>
         <w:t>:</w:t>
       </w:r>
       <w:r>
+        <w:rPr>
+          <w:rFonts w:asciiTheme="majorHAnsi" w:hAnsiTheme="majorHAnsi" w:cstheme="majorHAnsi"/>
+        </w:rPr>
         <w:t xml:space="preserve"> </w:t>
       </w:r>
       <w:r>
         <w:rPr>
           <w:rStyle w:val="VerbatimChar"/>
+          <w:rFonts w:asciiTheme="majorHAnsi" w:hAnsiTheme="majorHAnsi" w:cstheme="majorHAnsi"/>
         </w:rPr>
         <w:t>.</w:t>
       </w:r>
@@ -7204,6 +8008,7 @@
       <w:r>
         <w:rPr>
           <w:rStyle w:val="VerbatimChar"/>
+          <w:rFonts w:asciiTheme="majorHAnsi" w:hAnsiTheme="majorHAnsi" w:cstheme="majorHAnsi"/>
         </w:rPr>
         <w:t>kiro</w:t>
       </w:r>
@@ -7211,10 +8016,14 @@
       <w:r>
         <w:rPr>
           <w:rStyle w:val="VerbatimChar"/>
+          <w:rFonts w:asciiTheme="majorHAnsi" w:hAnsiTheme="majorHAnsi" w:cstheme="majorHAnsi"/>
         </w:rPr>
         <w:t>/docs/scenarios/digital-assistants-testing.md</w:t>
       </w:r>
       <w:r>
+        <w:rPr>
+          <w:rFonts w:asciiTheme="majorHAnsi" w:hAnsiTheme="majorHAnsi" w:cstheme="majorHAnsi"/>
+        </w:rPr>
         <w:t>.</w:t>
       </w:r>
     </w:p>
@@ -7225,9 +8034,13 @@
           <w:ilvl w:val="0"/>
           <w:numId w:val="13"/>
         </w:numPr>
-      </w:pPr>
-      <w:r>
-        <w:rPr>
+        <w:rPr>
+          <w:rFonts w:asciiTheme="majorHAnsi" w:hAnsiTheme="majorHAnsi" w:cstheme="majorHAnsi"/>
+        </w:rPr>
+      </w:pPr>
+      <w:r>
+        <w:rPr>
+          <w:rFonts w:asciiTheme="majorHAnsi" w:hAnsiTheme="majorHAnsi" w:cstheme="majorHAnsi"/>
           <w:b/>
           <w:bCs/>
         </w:rPr>
@@ -7236,17 +8049,22 @@
       <w:proofErr w:type="gramStart"/>
       <w:r>
         <w:rPr>
+          <w:rFonts w:asciiTheme="majorHAnsi" w:hAnsiTheme="majorHAnsi" w:cstheme="majorHAnsi"/>
           <w:b/>
           <w:bCs/>
         </w:rPr>
         <w:t>:</w:t>
       </w:r>
       <w:r>
+        <w:rPr>
+          <w:rFonts w:asciiTheme="majorHAnsi" w:hAnsiTheme="majorHAnsi" w:cstheme="majorHAnsi"/>
+        </w:rPr>
         <w:t xml:space="preserve"> </w:t>
       </w:r>
       <w:r>
         <w:rPr>
           <w:rStyle w:val="VerbatimChar"/>
+          <w:rFonts w:asciiTheme="majorHAnsi" w:hAnsiTheme="majorHAnsi" w:cstheme="majorHAnsi"/>
         </w:rPr>
         <w:t>.</w:t>
       </w:r>
@@ -7255,6 +8073,7 @@
       <w:r>
         <w:rPr>
           <w:rStyle w:val="VerbatimChar"/>
+          <w:rFonts w:asciiTheme="majorHAnsi" w:hAnsiTheme="majorHAnsi" w:cstheme="majorHAnsi"/>
         </w:rPr>
         <w:t>kiro</w:t>
       </w:r>
@@ -7262,16 +8081,21 @@
       <w:r>
         <w:rPr>
           <w:rStyle w:val="VerbatimChar"/>
+          <w:rFonts w:asciiTheme="majorHAnsi" w:hAnsiTheme="majorHAnsi" w:cstheme="majorHAnsi"/>
         </w:rPr>
         <w:t>/docs/Subscription_Tier_Model.md</w:t>
       </w:r>
       <w:r>
+        <w:rPr>
+          <w:rFonts w:asciiTheme="majorHAnsi" w:hAnsiTheme="majorHAnsi" w:cstheme="majorHAnsi"/>
+        </w:rPr>
         <w:t xml:space="preserve"> (</w:t>
       </w:r>
       <w:proofErr w:type="spellStart"/>
       <w:r>
         <w:rPr>
           <w:rStyle w:val="VerbatimChar"/>
+          <w:rFonts w:asciiTheme="majorHAnsi" w:hAnsiTheme="majorHAnsi" w:cstheme="majorHAnsi"/>
         </w:rPr>
         <w:t>digital_</w:t>
       </w:r>
@@ -7279,41 +8103,71 @@
       <w:r>
         <w:rPr>
           <w:rStyle w:val="VerbatimChar"/>
+          <w:rFonts w:asciiTheme="majorHAnsi" w:hAnsiTheme="majorHAnsi" w:cstheme="majorHAnsi"/>
         </w:rPr>
         <w:t>assistants</w:t>
       </w:r>
       <w:proofErr w:type="spellEnd"/>
       <w:proofErr w:type="gramEnd"/>
       <w:r>
+        <w:rPr>
+          <w:rFonts w:asciiTheme="majorHAnsi" w:hAnsiTheme="majorHAnsi" w:cstheme="majorHAnsi"/>
+        </w:rPr>
         <w:t xml:space="preserve"> module — Professional+).</w:t>
       </w:r>
     </w:p>
     <w:p>
-      <w:r>
+      <w:pPr>
+        <w:rPr>
+          <w:rFonts w:asciiTheme="majorHAnsi" w:hAnsiTheme="majorHAnsi" w:cstheme="majorHAnsi"/>
+        </w:rPr>
+      </w:pPr>
+      <w:r>
+        <w:rPr>
+          <w:rFonts w:asciiTheme="majorHAnsi" w:hAnsiTheme="majorHAnsi" w:cstheme="majorHAnsi"/>
+        </w:rPr>
         <w:t xml:space="preserve">Each group, when picked up, should get its own spec (requirements → design → tasks) rather than being built directly from this catalog. This document is </w:t>
       </w:r>
       <w:proofErr w:type="gramStart"/>
       <w:r>
+        <w:rPr>
+          <w:rFonts w:asciiTheme="majorHAnsi" w:hAnsiTheme="majorHAnsi" w:cstheme="majorHAnsi"/>
+        </w:rPr>
         <w:t>the</w:t>
       </w:r>
       <w:proofErr w:type="gramEnd"/>
       <w:r>
+        <w:rPr>
+          <w:rFonts w:asciiTheme="majorHAnsi" w:hAnsiTheme="majorHAnsi" w:cstheme="majorHAnsi"/>
+        </w:rPr>
         <w:t xml:space="preserve"> map, not </w:t>
       </w:r>
       <w:proofErr w:type="gramStart"/>
       <w:r>
+        <w:rPr>
+          <w:rFonts w:asciiTheme="majorHAnsi" w:hAnsiTheme="majorHAnsi" w:cstheme="majorHAnsi"/>
+        </w:rPr>
         <w:t>the</w:t>
       </w:r>
       <w:proofErr w:type="gramEnd"/>
       <w:r>
+        <w:rPr>
+          <w:rFonts w:asciiTheme="majorHAnsi" w:hAnsiTheme="majorHAnsi" w:cstheme="majorHAnsi"/>
+        </w:rPr>
         <w:t xml:space="preserve"> </w:t>
       </w:r>
       <w:proofErr w:type="gramStart"/>
       <w:r>
+        <w:rPr>
+          <w:rFonts w:asciiTheme="majorHAnsi" w:hAnsiTheme="majorHAnsi" w:cstheme="majorHAnsi"/>
+        </w:rPr>
         <w:t>build</w:t>
       </w:r>
       <w:proofErr w:type="gramEnd"/>
       <w:r>
+        <w:rPr>
+          <w:rFonts w:asciiTheme="majorHAnsi" w:hAnsiTheme="majorHAnsi" w:cstheme="majorHAnsi"/>
+        </w:rPr>
         <w:t xml:space="preserve"> plan.</w:t>
       </w:r>
     </w:p>

</xml_diff>